<commit_message>
feat(so): add new system templates
</commit_message>
<xml_diff>
--- a/document-merge-service/kt_so/templatefiles/bauentscheid.docx
+++ b/document-merge-service/kt_so/templatefiles/bauentscheid.docx
@@ -1,6 +1,6 @@
 
 <file path=word/document.xml><?xml version="1.0" encoding="utf-8"?>
-<w:document xmlns:wpc="http://schemas.microsoft.com/office/word/2010/wordprocessingCanvas" xmlns:cx="http://schemas.microsoft.com/office/drawing/2014/chartex" xmlns:cx1="http://schemas.microsoft.com/office/drawing/2015/9/8/chartex" xmlns:cx2="http://schemas.microsoft.com/office/drawing/2015/10/21/chartex" xmlns:cx3="http://schemas.microsoft.com/office/drawing/2016/5/9/chartex" xmlns:cx4="http://schemas.microsoft.com/office/drawing/2016/5/10/chartex" xmlns:cx5="http://schemas.microsoft.com/office/drawing/2016/5/11/chartex" xmlns:cx6="http://schemas.microsoft.com/office/drawing/2016/5/12/chartex" xmlns:cx7="http://schemas.microsoft.com/office/drawing/2016/5/13/chartex" xmlns:cx8="http://schemas.microsoft.com/office/drawing/2016/5/14/chartex" xmlns:mc="http://schemas.openxmlformats.org/markup-compatibility/2006" xmlns:aink="http://schemas.microsoft.com/office/drawing/2016/ink" xmlns:am3d="http://schemas.microsoft.com/office/drawing/2017/model3d" xmlns:o="urn:schemas-microsoft-com:office:office" xmlns:oel="http://schemas.microsoft.com/office/2019/extlst" xmlns:r="http://schemas.openxmlformats.org/officeDocument/2006/relationships" xmlns:m="http://schemas.openxmlformats.org/officeDocument/2006/math" xmlns:v="urn:schemas-microsoft-com:vml" xmlns:wp14="http://schemas.microsoft.com/office/word/2010/wordprocessingDrawing" xmlns:wp="http://schemas.openxmlformats.org/drawingml/2006/wordprocessingDrawing" xmlns:w10="urn:schemas-microsoft-com:office:word" xmlns:w="http://schemas.openxmlformats.org/wordprocessingml/2006/main" xmlns:w14="http://schemas.microsoft.com/office/word/2010/wordml" xmlns:w15="http://schemas.microsoft.com/office/word/2012/wordml" xmlns:w16cex="http://schemas.microsoft.com/office/word/2018/wordml/cex" xmlns:w16cid="http://schemas.microsoft.com/office/word/2016/wordml/cid" xmlns:w16="http://schemas.microsoft.com/office/word/2018/wordml" xmlns:w16du="http://schemas.microsoft.com/office/word/2023/wordml/word16du" xmlns:w16sdtdh="http://schemas.microsoft.com/office/word/2020/wordml/sdtdatahash" xmlns:w16se="http://schemas.microsoft.com/office/word/2015/wordml/symex" xmlns:wpg="http://schemas.microsoft.com/office/word/2010/wordprocessingGroup" xmlns:wpi="http://schemas.microsoft.com/office/word/2010/wordprocessingInk" xmlns:wne="http://schemas.microsoft.com/office/word/2006/wordml" xmlns:wps="http://schemas.microsoft.com/office/word/2010/wordprocessingShape" mc:Ignorable="w14 w15 w16se w16cid w16 w16cex w16sdtdh w16du wp14">
+<w:document xmlns:wpc="http://schemas.microsoft.com/office/word/2010/wordprocessingCanvas" xmlns:cx="http://schemas.microsoft.com/office/drawing/2014/chartex" xmlns:cx1="http://schemas.microsoft.com/office/drawing/2015/9/8/chartex" xmlns:cx2="http://schemas.microsoft.com/office/drawing/2015/10/21/chartex" xmlns:cx3="http://schemas.microsoft.com/office/drawing/2016/5/9/chartex" xmlns:cx4="http://schemas.microsoft.com/office/drawing/2016/5/10/chartex" xmlns:cx5="http://schemas.microsoft.com/office/drawing/2016/5/11/chartex" xmlns:cx6="http://schemas.microsoft.com/office/drawing/2016/5/12/chartex" xmlns:cx7="http://schemas.microsoft.com/office/drawing/2016/5/13/chartex" xmlns:cx8="http://schemas.microsoft.com/office/drawing/2016/5/14/chartex" xmlns:mc="http://schemas.openxmlformats.org/markup-compatibility/2006" xmlns:aink="http://schemas.microsoft.com/office/drawing/2016/ink" xmlns:am3d="http://schemas.microsoft.com/office/drawing/2017/model3d" xmlns:o="urn:schemas-microsoft-com:office:office" xmlns:oel="http://schemas.microsoft.com/office/2019/extlst" xmlns:r="http://schemas.openxmlformats.org/officeDocument/2006/relationships" xmlns:m="http://schemas.openxmlformats.org/officeDocument/2006/math" xmlns:v="urn:schemas-microsoft-com:vml" xmlns:wp14="http://schemas.microsoft.com/office/word/2010/wordprocessingDrawing" xmlns:wp="http://schemas.openxmlformats.org/drawingml/2006/wordprocessingDrawing" xmlns:w10="urn:schemas-microsoft-com:office:word" xmlns:w="http://schemas.openxmlformats.org/wordprocessingml/2006/main" xmlns:w14="http://schemas.microsoft.com/office/word/2010/wordml" xmlns:w15="http://schemas.microsoft.com/office/word/2012/wordml" xmlns:w16cex="http://schemas.microsoft.com/office/word/2018/wordml/cex" xmlns:w16cid="http://schemas.microsoft.com/office/word/2016/wordml/cid" xmlns:w16="http://schemas.microsoft.com/office/word/2018/wordml" xmlns:w16du="http://schemas.microsoft.com/office/word/2023/wordml/word16du" xmlns:w16sdtdh="http://schemas.microsoft.com/office/word/2020/wordml/sdtdatahash" xmlns:w16sdtfl="http://schemas.microsoft.com/office/word/2024/wordml/sdtformatlock" xmlns:w16se="http://schemas.microsoft.com/office/word/2015/wordml/symex" xmlns:wpg="http://schemas.microsoft.com/office/word/2010/wordprocessingGroup" xmlns:wpi="http://schemas.microsoft.com/office/word/2010/wordprocessingInk" xmlns:wne="http://schemas.microsoft.com/office/word/2006/wordml" xmlns:wps="http://schemas.microsoft.com/office/word/2010/wordprocessingShape" mc:Ignorable="w14 w15 w16se w16cid w16 w16cex w16sdtdh w16sdtfl w16du wp14">
   <w:body>
     <w:tbl>
       <w:tblPr>
@@ -374,7 +374,21 @@
               <w:rFonts w:eastAsiaTheme="minorHAnsi"/>
               <w:shd w:val="clear" w:color="auto" w:fill="FBE4D5" w:themeFill="accent2" w:themeFillTint="33"/>
             </w:rPr>
-            <w:t>Beschlussbehöre eingeben</w:t>
+            <w:t>Beschlussbehör</w:t>
+          </w:r>
+          <w:r>
+            <w:rPr>
+              <w:rFonts w:eastAsiaTheme="minorHAnsi"/>
+              <w:shd w:val="clear" w:color="auto" w:fill="FBE4D5" w:themeFill="accent2" w:themeFillTint="33"/>
+            </w:rPr>
+            <w:t>d</w:t>
+          </w:r>
+          <w:r>
+            <w:rPr>
+              <w:rFonts w:eastAsiaTheme="minorHAnsi"/>
+              <w:shd w:val="clear" w:color="auto" w:fill="FBE4D5" w:themeFill="accent2" w:themeFillTint="33"/>
+            </w:rPr>
+            <w:t>e eingeben</w:t>
           </w:r>
         </w:sdtContent>
       </w:sdt>
@@ -11590,41 +11604,77 @@
         <w:t xml:space="preserve">Gebühren für die Behandlung des Baugesuchs gemäss kommunalem Gebührenreglement </w:t>
       </w:r>
       <w:r>
+        <w:rPr>
+          <w:color w:val="FF0000"/>
+        </w:rPr>
         <w:t>(</w:t>
       </w:r>
       <w:r>
+        <w:rPr>
+          <w:color w:val="FF0000"/>
+        </w:rPr>
         <w:t xml:space="preserve">Achtung: Auferlegung von Kosten aus dem </w:t>
       </w:r>
       <w:proofErr w:type="spellStart"/>
       <w:r>
+        <w:rPr>
+          <w:color w:val="FF0000"/>
+        </w:rPr>
         <w:t>Einspracheverfahren</w:t>
       </w:r>
       <w:proofErr w:type="spellEnd"/>
       <w:r>
+        <w:rPr>
+          <w:color w:val="FF0000"/>
+        </w:rPr>
         <w:t xml:space="preserve"> an Einspreche</w:t>
       </w:r>
       <w:r>
+        <w:rPr>
+          <w:color w:val="FF0000"/>
+        </w:rPr>
         <w:t>n</w:t>
       </w:r>
       <w:r>
+        <w:rPr>
+          <w:color w:val="FF0000"/>
+        </w:rPr>
         <w:t>de</w:t>
       </w:r>
       <w:r>
+        <w:rPr>
+          <w:color w:val="FF0000"/>
+        </w:rPr>
         <w:t xml:space="preserve"> oder </w:t>
       </w:r>
       <w:r>
+        <w:rPr>
+          <w:color w:val="FF0000"/>
+        </w:rPr>
         <w:t>Gesuchstelle</w:t>
       </w:r>
       <w:r>
+        <w:rPr>
+          <w:color w:val="FF0000"/>
+        </w:rPr>
         <w:t>nde</w:t>
       </w:r>
       <w:r>
+        <w:rPr>
+          <w:color w:val="FF0000"/>
+        </w:rPr>
         <w:t xml:space="preserve"> ist nicht zulässig</w:t>
       </w:r>
       <w:r>
+        <w:rPr>
+          <w:color w:val="FF0000"/>
+        </w:rPr>
         <w:t>.</w:t>
       </w:r>
       <w:r>
+        <w:rPr>
+          <w:color w:val="FF0000"/>
+        </w:rPr>
         <w:t>)</w:t>
       </w:r>
     </w:p>
@@ -13580,7 +13630,7 @@
 </file>
 
 <file path=word/endnotes.xml><?xml version="1.0" encoding="utf-8"?>
-<w:endnotes xmlns:wpc="http://schemas.microsoft.com/office/word/2010/wordprocessingCanvas" xmlns:cx="http://schemas.microsoft.com/office/drawing/2014/chartex" xmlns:cx1="http://schemas.microsoft.com/office/drawing/2015/9/8/chartex" xmlns:cx2="http://schemas.microsoft.com/office/drawing/2015/10/21/chartex" xmlns:cx3="http://schemas.microsoft.com/office/drawing/2016/5/9/chartex" xmlns:cx4="http://schemas.microsoft.com/office/drawing/2016/5/10/chartex" xmlns:cx5="http://schemas.microsoft.com/office/drawing/2016/5/11/chartex" xmlns:cx6="http://schemas.microsoft.com/office/drawing/2016/5/12/chartex" xmlns:cx7="http://schemas.microsoft.com/office/drawing/2016/5/13/chartex" xmlns:cx8="http://schemas.microsoft.com/office/drawing/2016/5/14/chartex" xmlns:mc="http://schemas.openxmlformats.org/markup-compatibility/2006" xmlns:aink="http://schemas.microsoft.com/office/drawing/2016/ink" xmlns:am3d="http://schemas.microsoft.com/office/drawing/2017/model3d" xmlns:o="urn:schemas-microsoft-com:office:office" xmlns:oel="http://schemas.microsoft.com/office/2019/extlst" xmlns:r="http://schemas.openxmlformats.org/officeDocument/2006/relationships" xmlns:m="http://schemas.openxmlformats.org/officeDocument/2006/math" xmlns:v="urn:schemas-microsoft-com:vml" xmlns:wp14="http://schemas.microsoft.com/office/word/2010/wordprocessingDrawing" xmlns:wp="http://schemas.openxmlformats.org/drawingml/2006/wordprocessingDrawing" xmlns:w10="urn:schemas-microsoft-com:office:word" xmlns:w="http://schemas.openxmlformats.org/wordprocessingml/2006/main" xmlns:w14="http://schemas.microsoft.com/office/word/2010/wordml" xmlns:w15="http://schemas.microsoft.com/office/word/2012/wordml" xmlns:w16cex="http://schemas.microsoft.com/office/word/2018/wordml/cex" xmlns:w16cid="http://schemas.microsoft.com/office/word/2016/wordml/cid" xmlns:w16="http://schemas.microsoft.com/office/word/2018/wordml" xmlns:w16du="http://schemas.microsoft.com/office/word/2023/wordml/word16du" xmlns:w16sdtdh="http://schemas.microsoft.com/office/word/2020/wordml/sdtdatahash" xmlns:w16se="http://schemas.microsoft.com/office/word/2015/wordml/symex" xmlns:wpg="http://schemas.microsoft.com/office/word/2010/wordprocessingGroup" xmlns:wpi="http://schemas.microsoft.com/office/word/2010/wordprocessingInk" xmlns:wne="http://schemas.microsoft.com/office/word/2006/wordml" xmlns:wps="http://schemas.microsoft.com/office/word/2010/wordprocessingShape" mc:Ignorable="w14 w15 w16se w16cid w16 w16cex w16sdtdh w16du wp14">
+<w:endnotes xmlns:wpc="http://schemas.microsoft.com/office/word/2010/wordprocessingCanvas" xmlns:cx="http://schemas.microsoft.com/office/drawing/2014/chartex" xmlns:cx1="http://schemas.microsoft.com/office/drawing/2015/9/8/chartex" xmlns:cx2="http://schemas.microsoft.com/office/drawing/2015/10/21/chartex" xmlns:cx3="http://schemas.microsoft.com/office/drawing/2016/5/9/chartex" xmlns:cx4="http://schemas.microsoft.com/office/drawing/2016/5/10/chartex" xmlns:cx5="http://schemas.microsoft.com/office/drawing/2016/5/11/chartex" xmlns:cx6="http://schemas.microsoft.com/office/drawing/2016/5/12/chartex" xmlns:cx7="http://schemas.microsoft.com/office/drawing/2016/5/13/chartex" xmlns:cx8="http://schemas.microsoft.com/office/drawing/2016/5/14/chartex" xmlns:mc="http://schemas.openxmlformats.org/markup-compatibility/2006" xmlns:aink="http://schemas.microsoft.com/office/drawing/2016/ink" xmlns:am3d="http://schemas.microsoft.com/office/drawing/2017/model3d" xmlns:o="urn:schemas-microsoft-com:office:office" xmlns:oel="http://schemas.microsoft.com/office/2019/extlst" xmlns:r="http://schemas.openxmlformats.org/officeDocument/2006/relationships" xmlns:m="http://schemas.openxmlformats.org/officeDocument/2006/math" xmlns:v="urn:schemas-microsoft-com:vml" xmlns:wp14="http://schemas.microsoft.com/office/word/2010/wordprocessingDrawing" xmlns:wp="http://schemas.openxmlformats.org/drawingml/2006/wordprocessingDrawing" xmlns:w10="urn:schemas-microsoft-com:office:word" xmlns:w="http://schemas.openxmlformats.org/wordprocessingml/2006/main" xmlns:w14="http://schemas.microsoft.com/office/word/2010/wordml" xmlns:w15="http://schemas.microsoft.com/office/word/2012/wordml" xmlns:w16cex="http://schemas.microsoft.com/office/word/2018/wordml/cex" xmlns:w16cid="http://schemas.microsoft.com/office/word/2016/wordml/cid" xmlns:w16="http://schemas.microsoft.com/office/word/2018/wordml" xmlns:w16du="http://schemas.microsoft.com/office/word/2023/wordml/word16du" xmlns:w16sdtdh="http://schemas.microsoft.com/office/word/2020/wordml/sdtdatahash" xmlns:w16sdtfl="http://schemas.microsoft.com/office/word/2024/wordml/sdtformatlock" xmlns:w16se="http://schemas.microsoft.com/office/word/2015/wordml/symex" xmlns:wpg="http://schemas.microsoft.com/office/word/2010/wordprocessingGroup" xmlns:wpi="http://schemas.microsoft.com/office/word/2010/wordprocessingInk" xmlns:wne="http://schemas.microsoft.com/office/word/2006/wordml" xmlns:wps="http://schemas.microsoft.com/office/word/2010/wordprocessingShape" mc:Ignorable="w14 w15 w16se w16cid w16 w16cex w16sdtdh w16sdtfl w16du wp14">
   <w:endnote w:type="separator" w:id="-1">
     <w:p>
       <w:r>
@@ -13599,7 +13649,7 @@
 </file>
 
 <file path=word/footer1.xml><?xml version="1.0" encoding="utf-8"?>
-<w:ftr xmlns:wpc="http://schemas.microsoft.com/office/word/2010/wordprocessingCanvas" xmlns:cx="http://schemas.microsoft.com/office/drawing/2014/chartex" xmlns:cx1="http://schemas.microsoft.com/office/drawing/2015/9/8/chartex" xmlns:cx2="http://schemas.microsoft.com/office/drawing/2015/10/21/chartex" xmlns:cx3="http://schemas.microsoft.com/office/drawing/2016/5/9/chartex" xmlns:cx4="http://schemas.microsoft.com/office/drawing/2016/5/10/chartex" xmlns:cx5="http://schemas.microsoft.com/office/drawing/2016/5/11/chartex" xmlns:cx6="http://schemas.microsoft.com/office/drawing/2016/5/12/chartex" xmlns:cx7="http://schemas.microsoft.com/office/drawing/2016/5/13/chartex" xmlns:cx8="http://schemas.microsoft.com/office/drawing/2016/5/14/chartex" xmlns:mc="http://schemas.openxmlformats.org/markup-compatibility/2006" xmlns:aink="http://schemas.microsoft.com/office/drawing/2016/ink" xmlns:am3d="http://schemas.microsoft.com/office/drawing/2017/model3d" xmlns:o="urn:schemas-microsoft-com:office:office" xmlns:oel="http://schemas.microsoft.com/office/2019/extlst" xmlns:r="http://schemas.openxmlformats.org/officeDocument/2006/relationships" xmlns:m="http://schemas.openxmlformats.org/officeDocument/2006/math" xmlns:v="urn:schemas-microsoft-com:vml" xmlns:wp14="http://schemas.microsoft.com/office/word/2010/wordprocessingDrawing" xmlns:wp="http://schemas.openxmlformats.org/drawingml/2006/wordprocessingDrawing" xmlns:w10="urn:schemas-microsoft-com:office:word" xmlns:w="http://schemas.openxmlformats.org/wordprocessingml/2006/main" xmlns:w14="http://schemas.microsoft.com/office/word/2010/wordml" xmlns:w15="http://schemas.microsoft.com/office/word/2012/wordml" xmlns:w16cex="http://schemas.microsoft.com/office/word/2018/wordml/cex" xmlns:w16cid="http://schemas.microsoft.com/office/word/2016/wordml/cid" xmlns:w16="http://schemas.microsoft.com/office/word/2018/wordml" xmlns:w16du="http://schemas.microsoft.com/office/word/2023/wordml/word16du" xmlns:w16sdtdh="http://schemas.microsoft.com/office/word/2020/wordml/sdtdatahash" xmlns:w16se="http://schemas.microsoft.com/office/word/2015/wordml/symex" xmlns:wpg="http://schemas.microsoft.com/office/word/2010/wordprocessingGroup" xmlns:wpi="http://schemas.microsoft.com/office/word/2010/wordprocessingInk" xmlns:wne="http://schemas.microsoft.com/office/word/2006/wordml" xmlns:wps="http://schemas.microsoft.com/office/word/2010/wordprocessingShape" mc:Ignorable="w14 w15 w16se w16cid w16 w16cex w16sdtdh w16du wp14">
+<w:ftr xmlns:wpc="http://schemas.microsoft.com/office/word/2010/wordprocessingCanvas" xmlns:cx="http://schemas.microsoft.com/office/drawing/2014/chartex" xmlns:cx1="http://schemas.microsoft.com/office/drawing/2015/9/8/chartex" xmlns:cx2="http://schemas.microsoft.com/office/drawing/2015/10/21/chartex" xmlns:cx3="http://schemas.microsoft.com/office/drawing/2016/5/9/chartex" xmlns:cx4="http://schemas.microsoft.com/office/drawing/2016/5/10/chartex" xmlns:cx5="http://schemas.microsoft.com/office/drawing/2016/5/11/chartex" xmlns:cx6="http://schemas.microsoft.com/office/drawing/2016/5/12/chartex" xmlns:cx7="http://schemas.microsoft.com/office/drawing/2016/5/13/chartex" xmlns:cx8="http://schemas.microsoft.com/office/drawing/2016/5/14/chartex" xmlns:mc="http://schemas.openxmlformats.org/markup-compatibility/2006" xmlns:aink="http://schemas.microsoft.com/office/drawing/2016/ink" xmlns:am3d="http://schemas.microsoft.com/office/drawing/2017/model3d" xmlns:o="urn:schemas-microsoft-com:office:office" xmlns:oel="http://schemas.microsoft.com/office/2019/extlst" xmlns:r="http://schemas.openxmlformats.org/officeDocument/2006/relationships" xmlns:m="http://schemas.openxmlformats.org/officeDocument/2006/math" xmlns:v="urn:schemas-microsoft-com:vml" xmlns:wp14="http://schemas.microsoft.com/office/word/2010/wordprocessingDrawing" xmlns:wp="http://schemas.openxmlformats.org/drawingml/2006/wordprocessingDrawing" xmlns:w10="urn:schemas-microsoft-com:office:word" xmlns:w="http://schemas.openxmlformats.org/wordprocessingml/2006/main" xmlns:w14="http://schemas.microsoft.com/office/word/2010/wordml" xmlns:w15="http://schemas.microsoft.com/office/word/2012/wordml" xmlns:w16cex="http://schemas.microsoft.com/office/word/2018/wordml/cex" xmlns:w16cid="http://schemas.microsoft.com/office/word/2016/wordml/cid" xmlns:w16="http://schemas.microsoft.com/office/word/2018/wordml" xmlns:w16du="http://schemas.microsoft.com/office/word/2023/wordml/word16du" xmlns:w16sdtdh="http://schemas.microsoft.com/office/word/2020/wordml/sdtdatahash" xmlns:w16sdtfl="http://schemas.microsoft.com/office/word/2024/wordml/sdtformatlock" xmlns:w16se="http://schemas.microsoft.com/office/word/2015/wordml/symex" xmlns:wpg="http://schemas.microsoft.com/office/word/2010/wordprocessingGroup" xmlns:wpi="http://schemas.microsoft.com/office/word/2010/wordprocessingInk" xmlns:wne="http://schemas.microsoft.com/office/word/2006/wordml" xmlns:wps="http://schemas.microsoft.com/office/word/2010/wordprocessingShape" mc:Ignorable="w14 w15 w16se w16cid w16 w16cex w16sdtdh w16sdtfl w16du wp14">
   <w:p>
     <w:pPr>
       <w:pStyle w:val="Fuzeile"/>
@@ -13609,7 +13659,7 @@
 </file>
 
 <file path=word/footer2.xml><?xml version="1.0" encoding="utf-8"?>
-<w:ftr xmlns:wpc="http://schemas.microsoft.com/office/word/2010/wordprocessingCanvas" xmlns:cx="http://schemas.microsoft.com/office/drawing/2014/chartex" xmlns:cx1="http://schemas.microsoft.com/office/drawing/2015/9/8/chartex" xmlns:cx2="http://schemas.microsoft.com/office/drawing/2015/10/21/chartex" xmlns:cx3="http://schemas.microsoft.com/office/drawing/2016/5/9/chartex" xmlns:cx4="http://schemas.microsoft.com/office/drawing/2016/5/10/chartex" xmlns:cx5="http://schemas.microsoft.com/office/drawing/2016/5/11/chartex" xmlns:cx6="http://schemas.microsoft.com/office/drawing/2016/5/12/chartex" xmlns:cx7="http://schemas.microsoft.com/office/drawing/2016/5/13/chartex" xmlns:cx8="http://schemas.microsoft.com/office/drawing/2016/5/14/chartex" xmlns:mc="http://schemas.openxmlformats.org/markup-compatibility/2006" xmlns:aink="http://schemas.microsoft.com/office/drawing/2016/ink" xmlns:am3d="http://schemas.microsoft.com/office/drawing/2017/model3d" xmlns:o="urn:schemas-microsoft-com:office:office" xmlns:oel="http://schemas.microsoft.com/office/2019/extlst" xmlns:r="http://schemas.openxmlformats.org/officeDocument/2006/relationships" xmlns:m="http://schemas.openxmlformats.org/officeDocument/2006/math" xmlns:v="urn:schemas-microsoft-com:vml" xmlns:wp14="http://schemas.microsoft.com/office/word/2010/wordprocessingDrawing" xmlns:wp="http://schemas.openxmlformats.org/drawingml/2006/wordprocessingDrawing" xmlns:w10="urn:schemas-microsoft-com:office:word" xmlns:w="http://schemas.openxmlformats.org/wordprocessingml/2006/main" xmlns:w14="http://schemas.microsoft.com/office/word/2010/wordml" xmlns:w15="http://schemas.microsoft.com/office/word/2012/wordml" xmlns:w16cex="http://schemas.microsoft.com/office/word/2018/wordml/cex" xmlns:w16cid="http://schemas.microsoft.com/office/word/2016/wordml/cid" xmlns:w16="http://schemas.microsoft.com/office/word/2018/wordml" xmlns:w16du="http://schemas.microsoft.com/office/word/2023/wordml/word16du" xmlns:w16sdtdh="http://schemas.microsoft.com/office/word/2020/wordml/sdtdatahash" xmlns:w16se="http://schemas.microsoft.com/office/word/2015/wordml/symex" xmlns:wpg="http://schemas.microsoft.com/office/word/2010/wordprocessingGroup" xmlns:wpi="http://schemas.microsoft.com/office/word/2010/wordprocessingInk" xmlns:wne="http://schemas.microsoft.com/office/word/2006/wordml" xmlns:wps="http://schemas.microsoft.com/office/word/2010/wordprocessingShape" mc:Ignorable="w14 w15 w16se w16cid w16 w16cex w16sdtdh w16du wp14">
+<w:ftr xmlns:wpc="http://schemas.microsoft.com/office/word/2010/wordprocessingCanvas" xmlns:cx="http://schemas.microsoft.com/office/drawing/2014/chartex" xmlns:cx1="http://schemas.microsoft.com/office/drawing/2015/9/8/chartex" xmlns:cx2="http://schemas.microsoft.com/office/drawing/2015/10/21/chartex" xmlns:cx3="http://schemas.microsoft.com/office/drawing/2016/5/9/chartex" xmlns:cx4="http://schemas.microsoft.com/office/drawing/2016/5/10/chartex" xmlns:cx5="http://schemas.microsoft.com/office/drawing/2016/5/11/chartex" xmlns:cx6="http://schemas.microsoft.com/office/drawing/2016/5/12/chartex" xmlns:cx7="http://schemas.microsoft.com/office/drawing/2016/5/13/chartex" xmlns:cx8="http://schemas.microsoft.com/office/drawing/2016/5/14/chartex" xmlns:mc="http://schemas.openxmlformats.org/markup-compatibility/2006" xmlns:aink="http://schemas.microsoft.com/office/drawing/2016/ink" xmlns:am3d="http://schemas.microsoft.com/office/drawing/2017/model3d" xmlns:o="urn:schemas-microsoft-com:office:office" xmlns:oel="http://schemas.microsoft.com/office/2019/extlst" xmlns:r="http://schemas.openxmlformats.org/officeDocument/2006/relationships" xmlns:m="http://schemas.openxmlformats.org/officeDocument/2006/math" xmlns:v="urn:schemas-microsoft-com:vml" xmlns:wp14="http://schemas.microsoft.com/office/word/2010/wordprocessingDrawing" xmlns:wp="http://schemas.openxmlformats.org/drawingml/2006/wordprocessingDrawing" xmlns:w10="urn:schemas-microsoft-com:office:word" xmlns:w="http://schemas.openxmlformats.org/wordprocessingml/2006/main" xmlns:w14="http://schemas.microsoft.com/office/word/2010/wordml" xmlns:w15="http://schemas.microsoft.com/office/word/2012/wordml" xmlns:w16cex="http://schemas.microsoft.com/office/word/2018/wordml/cex" xmlns:w16cid="http://schemas.microsoft.com/office/word/2016/wordml/cid" xmlns:w16="http://schemas.microsoft.com/office/word/2018/wordml" xmlns:w16du="http://schemas.microsoft.com/office/word/2023/wordml/word16du" xmlns:w16sdtdh="http://schemas.microsoft.com/office/word/2020/wordml/sdtdatahash" xmlns:w16sdtfl="http://schemas.microsoft.com/office/word/2024/wordml/sdtformatlock" xmlns:w16se="http://schemas.microsoft.com/office/word/2015/wordml/symex" xmlns:wpg="http://schemas.microsoft.com/office/word/2010/wordprocessingGroup" xmlns:wpi="http://schemas.microsoft.com/office/word/2010/wordprocessingInk" xmlns:wne="http://schemas.microsoft.com/office/word/2006/wordml" xmlns:wps="http://schemas.microsoft.com/office/word/2010/wordprocessingShape" mc:Ignorable="w14 w15 w16se w16cid w16 w16cex w16sdtdh w16sdtfl w16du wp14">
   <w:p>
     <w:pPr>
       <w:tabs>
@@ -13860,7 +13910,7 @@
 </file>
 
 <file path=word/footer3.xml><?xml version="1.0" encoding="utf-8"?>
-<w:ftr xmlns:wpc="http://schemas.microsoft.com/office/word/2010/wordprocessingCanvas" xmlns:cx="http://schemas.microsoft.com/office/drawing/2014/chartex" xmlns:cx1="http://schemas.microsoft.com/office/drawing/2015/9/8/chartex" xmlns:cx2="http://schemas.microsoft.com/office/drawing/2015/10/21/chartex" xmlns:cx3="http://schemas.microsoft.com/office/drawing/2016/5/9/chartex" xmlns:cx4="http://schemas.microsoft.com/office/drawing/2016/5/10/chartex" xmlns:cx5="http://schemas.microsoft.com/office/drawing/2016/5/11/chartex" xmlns:cx6="http://schemas.microsoft.com/office/drawing/2016/5/12/chartex" xmlns:cx7="http://schemas.microsoft.com/office/drawing/2016/5/13/chartex" xmlns:cx8="http://schemas.microsoft.com/office/drawing/2016/5/14/chartex" xmlns:mc="http://schemas.openxmlformats.org/markup-compatibility/2006" xmlns:aink="http://schemas.microsoft.com/office/drawing/2016/ink" xmlns:am3d="http://schemas.microsoft.com/office/drawing/2017/model3d" xmlns:o="urn:schemas-microsoft-com:office:office" xmlns:oel="http://schemas.microsoft.com/office/2019/extlst" xmlns:r="http://schemas.openxmlformats.org/officeDocument/2006/relationships" xmlns:m="http://schemas.openxmlformats.org/officeDocument/2006/math" xmlns:v="urn:schemas-microsoft-com:vml" xmlns:wp14="http://schemas.microsoft.com/office/word/2010/wordprocessingDrawing" xmlns:wp="http://schemas.openxmlformats.org/drawingml/2006/wordprocessingDrawing" xmlns:w10="urn:schemas-microsoft-com:office:word" xmlns:w="http://schemas.openxmlformats.org/wordprocessingml/2006/main" xmlns:w14="http://schemas.microsoft.com/office/word/2010/wordml" xmlns:w15="http://schemas.microsoft.com/office/word/2012/wordml" xmlns:w16cex="http://schemas.microsoft.com/office/word/2018/wordml/cex" xmlns:w16cid="http://schemas.microsoft.com/office/word/2016/wordml/cid" xmlns:w16="http://schemas.microsoft.com/office/word/2018/wordml" xmlns:w16du="http://schemas.microsoft.com/office/word/2023/wordml/word16du" xmlns:w16sdtdh="http://schemas.microsoft.com/office/word/2020/wordml/sdtdatahash" xmlns:w16se="http://schemas.microsoft.com/office/word/2015/wordml/symex" xmlns:wpg="http://schemas.microsoft.com/office/word/2010/wordprocessingGroup" xmlns:wpi="http://schemas.microsoft.com/office/word/2010/wordprocessingInk" xmlns:wne="http://schemas.microsoft.com/office/word/2006/wordml" xmlns:wps="http://schemas.microsoft.com/office/word/2010/wordprocessingShape" mc:Ignorable="w14 w15 w16se w16cid w16 w16cex w16sdtdh w16du wp14">
+<w:ftr xmlns:wpc="http://schemas.microsoft.com/office/word/2010/wordprocessingCanvas" xmlns:cx="http://schemas.microsoft.com/office/drawing/2014/chartex" xmlns:cx1="http://schemas.microsoft.com/office/drawing/2015/9/8/chartex" xmlns:cx2="http://schemas.microsoft.com/office/drawing/2015/10/21/chartex" xmlns:cx3="http://schemas.microsoft.com/office/drawing/2016/5/9/chartex" xmlns:cx4="http://schemas.microsoft.com/office/drawing/2016/5/10/chartex" xmlns:cx5="http://schemas.microsoft.com/office/drawing/2016/5/11/chartex" xmlns:cx6="http://schemas.microsoft.com/office/drawing/2016/5/12/chartex" xmlns:cx7="http://schemas.microsoft.com/office/drawing/2016/5/13/chartex" xmlns:cx8="http://schemas.microsoft.com/office/drawing/2016/5/14/chartex" xmlns:mc="http://schemas.openxmlformats.org/markup-compatibility/2006" xmlns:aink="http://schemas.microsoft.com/office/drawing/2016/ink" xmlns:am3d="http://schemas.microsoft.com/office/drawing/2017/model3d" xmlns:o="urn:schemas-microsoft-com:office:office" xmlns:oel="http://schemas.microsoft.com/office/2019/extlst" xmlns:r="http://schemas.openxmlformats.org/officeDocument/2006/relationships" xmlns:m="http://schemas.openxmlformats.org/officeDocument/2006/math" xmlns:v="urn:schemas-microsoft-com:vml" xmlns:wp14="http://schemas.microsoft.com/office/word/2010/wordprocessingDrawing" xmlns:wp="http://schemas.openxmlformats.org/drawingml/2006/wordprocessingDrawing" xmlns:w10="urn:schemas-microsoft-com:office:word" xmlns:w="http://schemas.openxmlformats.org/wordprocessingml/2006/main" xmlns:w14="http://schemas.microsoft.com/office/word/2010/wordml" xmlns:w15="http://schemas.microsoft.com/office/word/2012/wordml" xmlns:w16cex="http://schemas.microsoft.com/office/word/2018/wordml/cex" xmlns:w16cid="http://schemas.microsoft.com/office/word/2016/wordml/cid" xmlns:w16="http://schemas.microsoft.com/office/word/2018/wordml" xmlns:w16du="http://schemas.microsoft.com/office/word/2023/wordml/word16du" xmlns:w16sdtdh="http://schemas.microsoft.com/office/word/2020/wordml/sdtdatahash" xmlns:w16sdtfl="http://schemas.microsoft.com/office/word/2024/wordml/sdtformatlock" xmlns:w16se="http://schemas.microsoft.com/office/word/2015/wordml/symex" xmlns:wpg="http://schemas.microsoft.com/office/word/2010/wordprocessingGroup" xmlns:wpi="http://schemas.microsoft.com/office/word/2010/wordprocessingInk" xmlns:wne="http://schemas.microsoft.com/office/word/2006/wordml" xmlns:wps="http://schemas.microsoft.com/office/word/2010/wordprocessingShape" mc:Ignorable="w14 w15 w16se w16cid w16 w16cex w16sdtdh w16sdtfl w16du wp14">
   <w:p>
     <w:pPr>
       <w:tabs>
@@ -14096,7 +14146,7 @@
 </file>
 
 <file path=word/footnotes.xml><?xml version="1.0" encoding="utf-8"?>
-<w:footnotes xmlns:wpc="http://schemas.microsoft.com/office/word/2010/wordprocessingCanvas" xmlns:cx="http://schemas.microsoft.com/office/drawing/2014/chartex" xmlns:cx1="http://schemas.microsoft.com/office/drawing/2015/9/8/chartex" xmlns:cx2="http://schemas.microsoft.com/office/drawing/2015/10/21/chartex" xmlns:cx3="http://schemas.microsoft.com/office/drawing/2016/5/9/chartex" xmlns:cx4="http://schemas.microsoft.com/office/drawing/2016/5/10/chartex" xmlns:cx5="http://schemas.microsoft.com/office/drawing/2016/5/11/chartex" xmlns:cx6="http://schemas.microsoft.com/office/drawing/2016/5/12/chartex" xmlns:cx7="http://schemas.microsoft.com/office/drawing/2016/5/13/chartex" xmlns:cx8="http://schemas.microsoft.com/office/drawing/2016/5/14/chartex" xmlns:mc="http://schemas.openxmlformats.org/markup-compatibility/2006" xmlns:aink="http://schemas.microsoft.com/office/drawing/2016/ink" xmlns:am3d="http://schemas.microsoft.com/office/drawing/2017/model3d" xmlns:o="urn:schemas-microsoft-com:office:office" xmlns:oel="http://schemas.microsoft.com/office/2019/extlst" xmlns:r="http://schemas.openxmlformats.org/officeDocument/2006/relationships" xmlns:m="http://schemas.openxmlformats.org/officeDocument/2006/math" xmlns:v="urn:schemas-microsoft-com:vml" xmlns:wp14="http://schemas.microsoft.com/office/word/2010/wordprocessingDrawing" xmlns:wp="http://schemas.openxmlformats.org/drawingml/2006/wordprocessingDrawing" xmlns:w10="urn:schemas-microsoft-com:office:word" xmlns:w="http://schemas.openxmlformats.org/wordprocessingml/2006/main" xmlns:w14="http://schemas.microsoft.com/office/word/2010/wordml" xmlns:w15="http://schemas.microsoft.com/office/word/2012/wordml" xmlns:w16cex="http://schemas.microsoft.com/office/word/2018/wordml/cex" xmlns:w16cid="http://schemas.microsoft.com/office/word/2016/wordml/cid" xmlns:w16="http://schemas.microsoft.com/office/word/2018/wordml" xmlns:w16du="http://schemas.microsoft.com/office/word/2023/wordml/word16du" xmlns:w16sdtdh="http://schemas.microsoft.com/office/word/2020/wordml/sdtdatahash" xmlns:w16se="http://schemas.microsoft.com/office/word/2015/wordml/symex" xmlns:wpg="http://schemas.microsoft.com/office/word/2010/wordprocessingGroup" xmlns:wpi="http://schemas.microsoft.com/office/word/2010/wordprocessingInk" xmlns:wne="http://schemas.microsoft.com/office/word/2006/wordml" xmlns:wps="http://schemas.microsoft.com/office/word/2010/wordprocessingShape" mc:Ignorable="w14 w15 w16se w16cid w16 w16cex w16sdtdh w16du wp14">
+<w:footnotes xmlns:wpc="http://schemas.microsoft.com/office/word/2010/wordprocessingCanvas" xmlns:cx="http://schemas.microsoft.com/office/drawing/2014/chartex" xmlns:cx1="http://schemas.microsoft.com/office/drawing/2015/9/8/chartex" xmlns:cx2="http://schemas.microsoft.com/office/drawing/2015/10/21/chartex" xmlns:cx3="http://schemas.microsoft.com/office/drawing/2016/5/9/chartex" xmlns:cx4="http://schemas.microsoft.com/office/drawing/2016/5/10/chartex" xmlns:cx5="http://schemas.microsoft.com/office/drawing/2016/5/11/chartex" xmlns:cx6="http://schemas.microsoft.com/office/drawing/2016/5/12/chartex" xmlns:cx7="http://schemas.microsoft.com/office/drawing/2016/5/13/chartex" xmlns:cx8="http://schemas.microsoft.com/office/drawing/2016/5/14/chartex" xmlns:mc="http://schemas.openxmlformats.org/markup-compatibility/2006" xmlns:aink="http://schemas.microsoft.com/office/drawing/2016/ink" xmlns:am3d="http://schemas.microsoft.com/office/drawing/2017/model3d" xmlns:o="urn:schemas-microsoft-com:office:office" xmlns:oel="http://schemas.microsoft.com/office/2019/extlst" xmlns:r="http://schemas.openxmlformats.org/officeDocument/2006/relationships" xmlns:m="http://schemas.openxmlformats.org/officeDocument/2006/math" xmlns:v="urn:schemas-microsoft-com:vml" xmlns:wp14="http://schemas.microsoft.com/office/word/2010/wordprocessingDrawing" xmlns:wp="http://schemas.openxmlformats.org/drawingml/2006/wordprocessingDrawing" xmlns:w10="urn:schemas-microsoft-com:office:word" xmlns:w="http://schemas.openxmlformats.org/wordprocessingml/2006/main" xmlns:w14="http://schemas.microsoft.com/office/word/2010/wordml" xmlns:w15="http://schemas.microsoft.com/office/word/2012/wordml" xmlns:w16cex="http://schemas.microsoft.com/office/word/2018/wordml/cex" xmlns:w16cid="http://schemas.microsoft.com/office/word/2016/wordml/cid" xmlns:w16="http://schemas.microsoft.com/office/word/2018/wordml" xmlns:w16du="http://schemas.microsoft.com/office/word/2023/wordml/word16du" xmlns:w16sdtdh="http://schemas.microsoft.com/office/word/2020/wordml/sdtdatahash" xmlns:w16sdtfl="http://schemas.microsoft.com/office/word/2024/wordml/sdtformatlock" xmlns:w16se="http://schemas.microsoft.com/office/word/2015/wordml/symex" xmlns:wpg="http://schemas.microsoft.com/office/word/2010/wordprocessingGroup" xmlns:wpi="http://schemas.microsoft.com/office/word/2010/wordprocessingInk" xmlns:wne="http://schemas.microsoft.com/office/word/2006/wordml" xmlns:wps="http://schemas.microsoft.com/office/word/2010/wordprocessingShape" mc:Ignorable="w14 w15 w16se w16cid w16 w16cex w16sdtdh w16sdtfl w16du wp14">
   <w:footnote w:type="separator" w:id="-1">
     <w:p>
       <w:r>
@@ -14115,7 +14165,7 @@
 </file>
 
 <file path=word/header1.xml><?xml version="1.0" encoding="utf-8"?>
-<w:hdr xmlns:wpc="http://schemas.microsoft.com/office/word/2010/wordprocessingCanvas" xmlns:cx="http://schemas.microsoft.com/office/drawing/2014/chartex" xmlns:cx1="http://schemas.microsoft.com/office/drawing/2015/9/8/chartex" xmlns:cx2="http://schemas.microsoft.com/office/drawing/2015/10/21/chartex" xmlns:cx3="http://schemas.microsoft.com/office/drawing/2016/5/9/chartex" xmlns:cx4="http://schemas.microsoft.com/office/drawing/2016/5/10/chartex" xmlns:cx5="http://schemas.microsoft.com/office/drawing/2016/5/11/chartex" xmlns:cx6="http://schemas.microsoft.com/office/drawing/2016/5/12/chartex" xmlns:cx7="http://schemas.microsoft.com/office/drawing/2016/5/13/chartex" xmlns:cx8="http://schemas.microsoft.com/office/drawing/2016/5/14/chartex" xmlns:mc="http://schemas.openxmlformats.org/markup-compatibility/2006" xmlns:aink="http://schemas.microsoft.com/office/drawing/2016/ink" xmlns:am3d="http://schemas.microsoft.com/office/drawing/2017/model3d" xmlns:o="urn:schemas-microsoft-com:office:office" xmlns:oel="http://schemas.microsoft.com/office/2019/extlst" xmlns:r="http://schemas.openxmlformats.org/officeDocument/2006/relationships" xmlns:m="http://schemas.openxmlformats.org/officeDocument/2006/math" xmlns:v="urn:schemas-microsoft-com:vml" xmlns:wp14="http://schemas.microsoft.com/office/word/2010/wordprocessingDrawing" xmlns:wp="http://schemas.openxmlformats.org/drawingml/2006/wordprocessingDrawing" xmlns:w10="urn:schemas-microsoft-com:office:word" xmlns:w="http://schemas.openxmlformats.org/wordprocessingml/2006/main" xmlns:w14="http://schemas.microsoft.com/office/word/2010/wordml" xmlns:w15="http://schemas.microsoft.com/office/word/2012/wordml" xmlns:w16cex="http://schemas.microsoft.com/office/word/2018/wordml/cex" xmlns:w16cid="http://schemas.microsoft.com/office/word/2016/wordml/cid" xmlns:w16="http://schemas.microsoft.com/office/word/2018/wordml" xmlns:w16du="http://schemas.microsoft.com/office/word/2023/wordml/word16du" xmlns:w16sdtdh="http://schemas.microsoft.com/office/word/2020/wordml/sdtdatahash" xmlns:w16se="http://schemas.microsoft.com/office/word/2015/wordml/symex" xmlns:wpg="http://schemas.microsoft.com/office/word/2010/wordprocessingGroup" xmlns:wpi="http://schemas.microsoft.com/office/word/2010/wordprocessingInk" xmlns:wne="http://schemas.microsoft.com/office/word/2006/wordml" xmlns:wps="http://schemas.microsoft.com/office/word/2010/wordprocessingShape" mc:Ignorable="w14 w15 w16se w16cid w16 w16cex w16sdtdh w16du wp14">
+<w:hdr xmlns:wpc="http://schemas.microsoft.com/office/word/2010/wordprocessingCanvas" xmlns:cx="http://schemas.microsoft.com/office/drawing/2014/chartex" xmlns:cx1="http://schemas.microsoft.com/office/drawing/2015/9/8/chartex" xmlns:cx2="http://schemas.microsoft.com/office/drawing/2015/10/21/chartex" xmlns:cx3="http://schemas.microsoft.com/office/drawing/2016/5/9/chartex" xmlns:cx4="http://schemas.microsoft.com/office/drawing/2016/5/10/chartex" xmlns:cx5="http://schemas.microsoft.com/office/drawing/2016/5/11/chartex" xmlns:cx6="http://schemas.microsoft.com/office/drawing/2016/5/12/chartex" xmlns:cx7="http://schemas.microsoft.com/office/drawing/2016/5/13/chartex" xmlns:cx8="http://schemas.microsoft.com/office/drawing/2016/5/14/chartex" xmlns:mc="http://schemas.openxmlformats.org/markup-compatibility/2006" xmlns:aink="http://schemas.microsoft.com/office/drawing/2016/ink" xmlns:am3d="http://schemas.microsoft.com/office/drawing/2017/model3d" xmlns:o="urn:schemas-microsoft-com:office:office" xmlns:oel="http://schemas.microsoft.com/office/2019/extlst" xmlns:r="http://schemas.openxmlformats.org/officeDocument/2006/relationships" xmlns:m="http://schemas.openxmlformats.org/officeDocument/2006/math" xmlns:v="urn:schemas-microsoft-com:vml" xmlns:wp14="http://schemas.microsoft.com/office/word/2010/wordprocessingDrawing" xmlns:wp="http://schemas.openxmlformats.org/drawingml/2006/wordprocessingDrawing" xmlns:w10="urn:schemas-microsoft-com:office:word" xmlns:w="http://schemas.openxmlformats.org/wordprocessingml/2006/main" xmlns:w14="http://schemas.microsoft.com/office/word/2010/wordml" xmlns:w15="http://schemas.microsoft.com/office/word/2012/wordml" xmlns:w16cex="http://schemas.microsoft.com/office/word/2018/wordml/cex" xmlns:w16cid="http://schemas.microsoft.com/office/word/2016/wordml/cid" xmlns:w16="http://schemas.microsoft.com/office/word/2018/wordml" xmlns:w16du="http://schemas.microsoft.com/office/word/2023/wordml/word16du" xmlns:w16sdtdh="http://schemas.microsoft.com/office/word/2020/wordml/sdtdatahash" xmlns:w16sdtfl="http://schemas.microsoft.com/office/word/2024/wordml/sdtformatlock" xmlns:w16se="http://schemas.microsoft.com/office/word/2015/wordml/symex" xmlns:wpg="http://schemas.microsoft.com/office/word/2010/wordprocessingGroup" xmlns:wpi="http://schemas.microsoft.com/office/word/2010/wordprocessingInk" xmlns:wne="http://schemas.microsoft.com/office/word/2006/wordml" xmlns:wps="http://schemas.microsoft.com/office/word/2010/wordprocessingShape" mc:Ignorable="w14 w15 w16se w16cid w16 w16cex w16sdtdh w16sdtfl w16du wp14">
   <w:p>
     <w:pPr>
       <w:pStyle w:val="Kopfzeile"/>
@@ -14125,7 +14175,7 @@
 </file>
 
 <file path=word/header2.xml><?xml version="1.0" encoding="utf-8"?>
-<w:hdr xmlns:wpc="http://schemas.microsoft.com/office/word/2010/wordprocessingCanvas" xmlns:cx="http://schemas.microsoft.com/office/drawing/2014/chartex" xmlns:cx1="http://schemas.microsoft.com/office/drawing/2015/9/8/chartex" xmlns:cx2="http://schemas.microsoft.com/office/drawing/2015/10/21/chartex" xmlns:cx3="http://schemas.microsoft.com/office/drawing/2016/5/9/chartex" xmlns:cx4="http://schemas.microsoft.com/office/drawing/2016/5/10/chartex" xmlns:cx5="http://schemas.microsoft.com/office/drawing/2016/5/11/chartex" xmlns:cx6="http://schemas.microsoft.com/office/drawing/2016/5/12/chartex" xmlns:cx7="http://schemas.microsoft.com/office/drawing/2016/5/13/chartex" xmlns:cx8="http://schemas.microsoft.com/office/drawing/2016/5/14/chartex" xmlns:mc="http://schemas.openxmlformats.org/markup-compatibility/2006" xmlns:aink="http://schemas.microsoft.com/office/drawing/2016/ink" xmlns:am3d="http://schemas.microsoft.com/office/drawing/2017/model3d" xmlns:o="urn:schemas-microsoft-com:office:office" xmlns:oel="http://schemas.microsoft.com/office/2019/extlst" xmlns:r="http://schemas.openxmlformats.org/officeDocument/2006/relationships" xmlns:m="http://schemas.openxmlformats.org/officeDocument/2006/math" xmlns:v="urn:schemas-microsoft-com:vml" xmlns:wp14="http://schemas.microsoft.com/office/word/2010/wordprocessingDrawing" xmlns:wp="http://schemas.openxmlformats.org/drawingml/2006/wordprocessingDrawing" xmlns:w10="urn:schemas-microsoft-com:office:word" xmlns:w="http://schemas.openxmlformats.org/wordprocessingml/2006/main" xmlns:w14="http://schemas.microsoft.com/office/word/2010/wordml" xmlns:w15="http://schemas.microsoft.com/office/word/2012/wordml" xmlns:w16cex="http://schemas.microsoft.com/office/word/2018/wordml/cex" xmlns:w16cid="http://schemas.microsoft.com/office/word/2016/wordml/cid" xmlns:w16="http://schemas.microsoft.com/office/word/2018/wordml" xmlns:w16du="http://schemas.microsoft.com/office/word/2023/wordml/word16du" xmlns:w16sdtdh="http://schemas.microsoft.com/office/word/2020/wordml/sdtdatahash" xmlns:w16se="http://schemas.microsoft.com/office/word/2015/wordml/symex" xmlns:wpg="http://schemas.microsoft.com/office/word/2010/wordprocessingGroup" xmlns:wpi="http://schemas.microsoft.com/office/word/2010/wordprocessingInk" xmlns:wne="http://schemas.microsoft.com/office/word/2006/wordml" xmlns:wps="http://schemas.microsoft.com/office/word/2010/wordprocessingShape" mc:Ignorable="w14 w15 w16se w16cid w16 w16cex w16sdtdh w16du wp14">
+<w:hdr xmlns:wpc="http://schemas.microsoft.com/office/word/2010/wordprocessingCanvas" xmlns:cx="http://schemas.microsoft.com/office/drawing/2014/chartex" xmlns:cx1="http://schemas.microsoft.com/office/drawing/2015/9/8/chartex" xmlns:cx2="http://schemas.microsoft.com/office/drawing/2015/10/21/chartex" xmlns:cx3="http://schemas.microsoft.com/office/drawing/2016/5/9/chartex" xmlns:cx4="http://schemas.microsoft.com/office/drawing/2016/5/10/chartex" xmlns:cx5="http://schemas.microsoft.com/office/drawing/2016/5/11/chartex" xmlns:cx6="http://schemas.microsoft.com/office/drawing/2016/5/12/chartex" xmlns:cx7="http://schemas.microsoft.com/office/drawing/2016/5/13/chartex" xmlns:cx8="http://schemas.microsoft.com/office/drawing/2016/5/14/chartex" xmlns:mc="http://schemas.openxmlformats.org/markup-compatibility/2006" xmlns:aink="http://schemas.microsoft.com/office/drawing/2016/ink" xmlns:am3d="http://schemas.microsoft.com/office/drawing/2017/model3d" xmlns:o="urn:schemas-microsoft-com:office:office" xmlns:oel="http://schemas.microsoft.com/office/2019/extlst" xmlns:r="http://schemas.openxmlformats.org/officeDocument/2006/relationships" xmlns:m="http://schemas.openxmlformats.org/officeDocument/2006/math" xmlns:v="urn:schemas-microsoft-com:vml" xmlns:wp14="http://schemas.microsoft.com/office/word/2010/wordprocessingDrawing" xmlns:wp="http://schemas.openxmlformats.org/drawingml/2006/wordprocessingDrawing" xmlns:w10="urn:schemas-microsoft-com:office:word" xmlns:w="http://schemas.openxmlformats.org/wordprocessingml/2006/main" xmlns:w14="http://schemas.microsoft.com/office/word/2010/wordml" xmlns:w15="http://schemas.microsoft.com/office/word/2012/wordml" xmlns:w16cex="http://schemas.microsoft.com/office/word/2018/wordml/cex" xmlns:w16cid="http://schemas.microsoft.com/office/word/2016/wordml/cid" xmlns:w16="http://schemas.microsoft.com/office/word/2018/wordml" xmlns:w16du="http://schemas.microsoft.com/office/word/2023/wordml/word16du" xmlns:w16sdtdh="http://schemas.microsoft.com/office/word/2020/wordml/sdtdatahash" xmlns:w16sdtfl="http://schemas.microsoft.com/office/word/2024/wordml/sdtformatlock" xmlns:w16se="http://schemas.microsoft.com/office/word/2015/wordml/symex" xmlns:wpg="http://schemas.microsoft.com/office/word/2010/wordprocessingGroup" xmlns:wpi="http://schemas.microsoft.com/office/word/2010/wordprocessingInk" xmlns:wne="http://schemas.microsoft.com/office/word/2006/wordml" xmlns:wps="http://schemas.microsoft.com/office/word/2010/wordprocessingShape" mc:Ignorable="w14 w15 w16se w16cid w16 w16cex w16sdtdh w16sdtfl w16du wp14">
   <w:p>
     <w:pPr>
       <w:jc w:val="right"/>
@@ -14135,7 +14185,7 @@
 </file>
 
 <file path=word/header3.xml><?xml version="1.0" encoding="utf-8"?>
-<w:hdr xmlns:wpc="http://schemas.microsoft.com/office/word/2010/wordprocessingCanvas" xmlns:cx="http://schemas.microsoft.com/office/drawing/2014/chartex" xmlns:cx1="http://schemas.microsoft.com/office/drawing/2015/9/8/chartex" xmlns:cx2="http://schemas.microsoft.com/office/drawing/2015/10/21/chartex" xmlns:cx3="http://schemas.microsoft.com/office/drawing/2016/5/9/chartex" xmlns:cx4="http://schemas.microsoft.com/office/drawing/2016/5/10/chartex" xmlns:cx5="http://schemas.microsoft.com/office/drawing/2016/5/11/chartex" xmlns:cx6="http://schemas.microsoft.com/office/drawing/2016/5/12/chartex" xmlns:cx7="http://schemas.microsoft.com/office/drawing/2016/5/13/chartex" xmlns:cx8="http://schemas.microsoft.com/office/drawing/2016/5/14/chartex" xmlns:mc="http://schemas.openxmlformats.org/markup-compatibility/2006" xmlns:aink="http://schemas.microsoft.com/office/drawing/2016/ink" xmlns:am3d="http://schemas.microsoft.com/office/drawing/2017/model3d" xmlns:o="urn:schemas-microsoft-com:office:office" xmlns:oel="http://schemas.microsoft.com/office/2019/extlst" xmlns:r="http://schemas.openxmlformats.org/officeDocument/2006/relationships" xmlns:m="http://schemas.openxmlformats.org/officeDocument/2006/math" xmlns:v="urn:schemas-microsoft-com:vml" xmlns:wp14="http://schemas.microsoft.com/office/word/2010/wordprocessingDrawing" xmlns:wp="http://schemas.openxmlformats.org/drawingml/2006/wordprocessingDrawing" xmlns:w10="urn:schemas-microsoft-com:office:word" xmlns:w="http://schemas.openxmlformats.org/wordprocessingml/2006/main" xmlns:w14="http://schemas.microsoft.com/office/word/2010/wordml" xmlns:w15="http://schemas.microsoft.com/office/word/2012/wordml" xmlns:w16cex="http://schemas.microsoft.com/office/word/2018/wordml/cex" xmlns:w16cid="http://schemas.microsoft.com/office/word/2016/wordml/cid" xmlns:w16="http://schemas.microsoft.com/office/word/2018/wordml" xmlns:w16du="http://schemas.microsoft.com/office/word/2023/wordml/word16du" xmlns:w16sdtdh="http://schemas.microsoft.com/office/word/2020/wordml/sdtdatahash" xmlns:w16se="http://schemas.microsoft.com/office/word/2015/wordml/symex" xmlns:wpg="http://schemas.microsoft.com/office/word/2010/wordprocessingGroup" xmlns:wpi="http://schemas.microsoft.com/office/word/2010/wordprocessingInk" xmlns:wne="http://schemas.microsoft.com/office/word/2006/wordml" xmlns:wps="http://schemas.microsoft.com/office/word/2010/wordprocessingShape" mc:Ignorable="w14 w15 w16se w16cid w16 w16cex w16sdtdh w16du wp14">
+<w:hdr xmlns:wpc="http://schemas.microsoft.com/office/word/2010/wordprocessingCanvas" xmlns:cx="http://schemas.microsoft.com/office/drawing/2014/chartex" xmlns:cx1="http://schemas.microsoft.com/office/drawing/2015/9/8/chartex" xmlns:cx2="http://schemas.microsoft.com/office/drawing/2015/10/21/chartex" xmlns:cx3="http://schemas.microsoft.com/office/drawing/2016/5/9/chartex" xmlns:cx4="http://schemas.microsoft.com/office/drawing/2016/5/10/chartex" xmlns:cx5="http://schemas.microsoft.com/office/drawing/2016/5/11/chartex" xmlns:cx6="http://schemas.microsoft.com/office/drawing/2016/5/12/chartex" xmlns:cx7="http://schemas.microsoft.com/office/drawing/2016/5/13/chartex" xmlns:cx8="http://schemas.microsoft.com/office/drawing/2016/5/14/chartex" xmlns:mc="http://schemas.openxmlformats.org/markup-compatibility/2006" xmlns:aink="http://schemas.microsoft.com/office/drawing/2016/ink" xmlns:am3d="http://schemas.microsoft.com/office/drawing/2017/model3d" xmlns:o="urn:schemas-microsoft-com:office:office" xmlns:oel="http://schemas.microsoft.com/office/2019/extlst" xmlns:r="http://schemas.openxmlformats.org/officeDocument/2006/relationships" xmlns:m="http://schemas.openxmlformats.org/officeDocument/2006/math" xmlns:v="urn:schemas-microsoft-com:vml" xmlns:wp14="http://schemas.microsoft.com/office/word/2010/wordprocessingDrawing" xmlns:wp="http://schemas.openxmlformats.org/drawingml/2006/wordprocessingDrawing" xmlns:w10="urn:schemas-microsoft-com:office:word" xmlns:w="http://schemas.openxmlformats.org/wordprocessingml/2006/main" xmlns:w14="http://schemas.microsoft.com/office/word/2010/wordml" xmlns:w15="http://schemas.microsoft.com/office/word/2012/wordml" xmlns:w16cex="http://schemas.microsoft.com/office/word/2018/wordml/cex" xmlns:w16cid="http://schemas.microsoft.com/office/word/2016/wordml/cid" xmlns:w16="http://schemas.microsoft.com/office/word/2018/wordml" xmlns:w16du="http://schemas.microsoft.com/office/word/2023/wordml/word16du" xmlns:w16sdtdh="http://schemas.microsoft.com/office/word/2020/wordml/sdtdatahash" xmlns:w16sdtfl="http://schemas.microsoft.com/office/word/2024/wordml/sdtformatlock" xmlns:w16se="http://schemas.microsoft.com/office/word/2015/wordml/symex" xmlns:wpg="http://schemas.microsoft.com/office/word/2010/wordprocessingGroup" xmlns:wpi="http://schemas.microsoft.com/office/word/2010/wordprocessingInk" xmlns:wne="http://schemas.microsoft.com/office/word/2006/wordml" xmlns:wps="http://schemas.microsoft.com/office/word/2010/wordprocessingShape" mc:Ignorable="w14 w15 w16se w16cid w16 w16cex w16sdtdh w16sdtfl w16du wp14">
   <w:p>
     <w:pPr>
       <w:pStyle w:val="Platzhalter"/>
@@ -14169,7 +14219,7 @@
 </file>
 
 <file path=word/numbering.xml><?xml version="1.0" encoding="utf-8"?>
-<w:numbering xmlns:wpc="http://schemas.microsoft.com/office/word/2010/wordprocessingCanvas" xmlns:cx="http://schemas.microsoft.com/office/drawing/2014/chartex" xmlns:cx1="http://schemas.microsoft.com/office/drawing/2015/9/8/chartex" xmlns:cx2="http://schemas.microsoft.com/office/drawing/2015/10/21/chartex" xmlns:cx3="http://schemas.microsoft.com/office/drawing/2016/5/9/chartex" xmlns:cx4="http://schemas.microsoft.com/office/drawing/2016/5/10/chartex" xmlns:cx5="http://schemas.microsoft.com/office/drawing/2016/5/11/chartex" xmlns:cx6="http://schemas.microsoft.com/office/drawing/2016/5/12/chartex" xmlns:cx7="http://schemas.microsoft.com/office/drawing/2016/5/13/chartex" xmlns:cx8="http://schemas.microsoft.com/office/drawing/2016/5/14/chartex" xmlns:mc="http://schemas.openxmlformats.org/markup-compatibility/2006" xmlns:aink="http://schemas.microsoft.com/office/drawing/2016/ink" xmlns:am3d="http://schemas.microsoft.com/office/drawing/2017/model3d" xmlns:o="urn:schemas-microsoft-com:office:office" xmlns:oel="http://schemas.microsoft.com/office/2019/extlst" xmlns:r="http://schemas.openxmlformats.org/officeDocument/2006/relationships" xmlns:m="http://schemas.openxmlformats.org/officeDocument/2006/math" xmlns:v="urn:schemas-microsoft-com:vml" xmlns:wp14="http://schemas.microsoft.com/office/word/2010/wordprocessingDrawing" xmlns:wp="http://schemas.openxmlformats.org/drawingml/2006/wordprocessingDrawing" xmlns:w10="urn:schemas-microsoft-com:office:word" xmlns:w="http://schemas.openxmlformats.org/wordprocessingml/2006/main" xmlns:w14="http://schemas.microsoft.com/office/word/2010/wordml" xmlns:w15="http://schemas.microsoft.com/office/word/2012/wordml" xmlns:w16cex="http://schemas.microsoft.com/office/word/2018/wordml/cex" xmlns:w16cid="http://schemas.microsoft.com/office/word/2016/wordml/cid" xmlns:w16="http://schemas.microsoft.com/office/word/2018/wordml" xmlns:w16du="http://schemas.microsoft.com/office/word/2023/wordml/word16du" xmlns:w16sdtdh="http://schemas.microsoft.com/office/word/2020/wordml/sdtdatahash" xmlns:w16se="http://schemas.microsoft.com/office/word/2015/wordml/symex" xmlns:wpg="http://schemas.microsoft.com/office/word/2010/wordprocessingGroup" xmlns:wpi="http://schemas.microsoft.com/office/word/2010/wordprocessingInk" xmlns:wne="http://schemas.microsoft.com/office/word/2006/wordml" xmlns:wps="http://schemas.microsoft.com/office/word/2010/wordprocessingShape" mc:Ignorable="w14 w15 w16se w16cid w16 w16cex w16sdtdh w16du wp14">
+<w:numbering xmlns:wpc="http://schemas.microsoft.com/office/word/2010/wordprocessingCanvas" xmlns:cx="http://schemas.microsoft.com/office/drawing/2014/chartex" xmlns:cx1="http://schemas.microsoft.com/office/drawing/2015/9/8/chartex" xmlns:cx2="http://schemas.microsoft.com/office/drawing/2015/10/21/chartex" xmlns:cx3="http://schemas.microsoft.com/office/drawing/2016/5/9/chartex" xmlns:cx4="http://schemas.microsoft.com/office/drawing/2016/5/10/chartex" xmlns:cx5="http://schemas.microsoft.com/office/drawing/2016/5/11/chartex" xmlns:cx6="http://schemas.microsoft.com/office/drawing/2016/5/12/chartex" xmlns:cx7="http://schemas.microsoft.com/office/drawing/2016/5/13/chartex" xmlns:cx8="http://schemas.microsoft.com/office/drawing/2016/5/14/chartex" xmlns:mc="http://schemas.openxmlformats.org/markup-compatibility/2006" xmlns:aink="http://schemas.microsoft.com/office/drawing/2016/ink" xmlns:am3d="http://schemas.microsoft.com/office/drawing/2017/model3d" xmlns:o="urn:schemas-microsoft-com:office:office" xmlns:oel="http://schemas.microsoft.com/office/2019/extlst" xmlns:r="http://schemas.openxmlformats.org/officeDocument/2006/relationships" xmlns:m="http://schemas.openxmlformats.org/officeDocument/2006/math" xmlns:v="urn:schemas-microsoft-com:vml" xmlns:wp14="http://schemas.microsoft.com/office/word/2010/wordprocessingDrawing" xmlns:wp="http://schemas.openxmlformats.org/drawingml/2006/wordprocessingDrawing" xmlns:w10="urn:schemas-microsoft-com:office:word" xmlns:w="http://schemas.openxmlformats.org/wordprocessingml/2006/main" xmlns:w14="http://schemas.microsoft.com/office/word/2010/wordml" xmlns:w15="http://schemas.microsoft.com/office/word/2012/wordml" xmlns:w16cex="http://schemas.microsoft.com/office/word/2018/wordml/cex" xmlns:w16cid="http://schemas.microsoft.com/office/word/2016/wordml/cid" xmlns:w16="http://schemas.microsoft.com/office/word/2018/wordml" xmlns:w16du="http://schemas.microsoft.com/office/word/2023/wordml/word16du" xmlns:w16sdtdh="http://schemas.microsoft.com/office/word/2020/wordml/sdtdatahash" xmlns:w16sdtfl="http://schemas.microsoft.com/office/word/2024/wordml/sdtformatlock" xmlns:w16se="http://schemas.microsoft.com/office/word/2015/wordml/symex" xmlns:wpg="http://schemas.microsoft.com/office/word/2010/wordprocessingGroup" xmlns:wpi="http://schemas.microsoft.com/office/word/2010/wordprocessingInk" xmlns:wne="http://schemas.microsoft.com/office/word/2006/wordml" xmlns:wps="http://schemas.microsoft.com/office/word/2010/wordprocessingShape" mc:Ignorable="w14 w15 w16se w16cid w16 w16cex w16sdtdh w16sdtfl w16du wp14">
   <w:abstractNum w:abstractNumId="0" w15:restartNumberingAfterBreak="0">
     <w:nsid w:val="05455E45"/>
     <w:multiLevelType w:val="multilevel"/>
@@ -16635,7 +16685,7 @@
 </file>
 
 <file path=word/styles.xml><?xml version="1.0" encoding="utf-8"?>
-<w:styles xmlns:mc="http://schemas.openxmlformats.org/markup-compatibility/2006" xmlns:r="http://schemas.openxmlformats.org/officeDocument/2006/relationships" xmlns:w="http://schemas.openxmlformats.org/wordprocessingml/2006/main" xmlns:w14="http://schemas.microsoft.com/office/word/2010/wordml" xmlns:w15="http://schemas.microsoft.com/office/word/2012/wordml" xmlns:w16cex="http://schemas.microsoft.com/office/word/2018/wordml/cex" xmlns:w16cid="http://schemas.microsoft.com/office/word/2016/wordml/cid" xmlns:w16="http://schemas.microsoft.com/office/word/2018/wordml" xmlns:w16du="http://schemas.microsoft.com/office/word/2023/wordml/word16du" xmlns:w16sdtdh="http://schemas.microsoft.com/office/word/2020/wordml/sdtdatahash" xmlns:w16se="http://schemas.microsoft.com/office/word/2015/wordml/symex" mc:Ignorable="w14 w15 w16se w16cid w16 w16cex w16sdtdh w16du">
+<w:styles xmlns:mc="http://schemas.openxmlformats.org/markup-compatibility/2006" xmlns:r="http://schemas.openxmlformats.org/officeDocument/2006/relationships" xmlns:w="http://schemas.openxmlformats.org/wordprocessingml/2006/main" xmlns:w14="http://schemas.microsoft.com/office/word/2010/wordml" xmlns:w15="http://schemas.microsoft.com/office/word/2012/wordml" xmlns:w16cex="http://schemas.microsoft.com/office/word/2018/wordml/cex" xmlns:w16cid="http://schemas.microsoft.com/office/word/2016/wordml/cid" xmlns:w16="http://schemas.microsoft.com/office/word/2018/wordml" xmlns:w16du="http://schemas.microsoft.com/office/word/2023/wordml/word16du" xmlns:w16sdtdh="http://schemas.microsoft.com/office/word/2020/wordml/sdtdatahash" xmlns:w16sdtfl="http://schemas.microsoft.com/office/word/2024/wordml/sdtformatlock" xmlns:w16se="http://schemas.microsoft.com/office/word/2015/wordml/symex" mc:Ignorable="w14 w15 w16se w16cid w16 w16cex w16sdtdh w16sdtfl w16du">
   <w:docDefaults>
     <w:rPrDefault>
       <w:rPr>
@@ -17755,7 +17805,7 @@
 </file>
 
 <file path=word/glossary/document.xml><?xml version="1.0" encoding="utf-8"?>
-<w:glossaryDocument xmlns:wpc="http://schemas.microsoft.com/office/word/2010/wordprocessingCanvas" xmlns:cx="http://schemas.microsoft.com/office/drawing/2014/chartex" xmlns:cx1="http://schemas.microsoft.com/office/drawing/2015/9/8/chartex" xmlns:cx2="http://schemas.microsoft.com/office/drawing/2015/10/21/chartex" xmlns:cx3="http://schemas.microsoft.com/office/drawing/2016/5/9/chartex" xmlns:cx4="http://schemas.microsoft.com/office/drawing/2016/5/10/chartex" xmlns:cx5="http://schemas.microsoft.com/office/drawing/2016/5/11/chartex" xmlns:cx6="http://schemas.microsoft.com/office/drawing/2016/5/12/chartex" xmlns:cx7="http://schemas.microsoft.com/office/drawing/2016/5/13/chartex" xmlns:cx8="http://schemas.microsoft.com/office/drawing/2016/5/14/chartex" xmlns:mc="http://schemas.openxmlformats.org/markup-compatibility/2006" xmlns:aink="http://schemas.microsoft.com/office/drawing/2016/ink" xmlns:am3d="http://schemas.microsoft.com/office/drawing/2017/model3d" xmlns:o="urn:schemas-microsoft-com:office:office" xmlns:oel="http://schemas.microsoft.com/office/2019/extlst" xmlns:r="http://schemas.openxmlformats.org/officeDocument/2006/relationships" xmlns:m="http://schemas.openxmlformats.org/officeDocument/2006/math" xmlns:v="urn:schemas-microsoft-com:vml" xmlns:wp14="http://schemas.microsoft.com/office/word/2010/wordprocessingDrawing" xmlns:wp="http://schemas.openxmlformats.org/drawingml/2006/wordprocessingDrawing" xmlns:w10="urn:schemas-microsoft-com:office:word" xmlns:w="http://schemas.openxmlformats.org/wordprocessingml/2006/main" xmlns:w14="http://schemas.microsoft.com/office/word/2010/wordml" xmlns:w15="http://schemas.microsoft.com/office/word/2012/wordml" xmlns:w16cex="http://schemas.microsoft.com/office/word/2018/wordml/cex" xmlns:w16cid="http://schemas.microsoft.com/office/word/2016/wordml/cid" xmlns:w16="http://schemas.microsoft.com/office/word/2018/wordml" xmlns:w16du="http://schemas.microsoft.com/office/word/2023/wordml/word16du" xmlns:w16sdtdh="http://schemas.microsoft.com/office/word/2020/wordml/sdtdatahash" xmlns:w16se="http://schemas.microsoft.com/office/word/2015/wordml/symex" xmlns:wpg="http://schemas.microsoft.com/office/word/2010/wordprocessingGroup" xmlns:wpi="http://schemas.microsoft.com/office/word/2010/wordprocessingInk" xmlns:wne="http://schemas.microsoft.com/office/word/2006/wordml" xmlns:wps="http://schemas.microsoft.com/office/word/2010/wordprocessingShape" mc:Ignorable="w14 w15 w16se w16cid w16 w16cex w16sdtdh w16du wp14">
+<w:glossaryDocument xmlns:wpc="http://schemas.microsoft.com/office/word/2010/wordprocessingCanvas" xmlns:cx="http://schemas.microsoft.com/office/drawing/2014/chartex" xmlns:cx1="http://schemas.microsoft.com/office/drawing/2015/9/8/chartex" xmlns:cx2="http://schemas.microsoft.com/office/drawing/2015/10/21/chartex" xmlns:cx3="http://schemas.microsoft.com/office/drawing/2016/5/9/chartex" xmlns:cx4="http://schemas.microsoft.com/office/drawing/2016/5/10/chartex" xmlns:cx5="http://schemas.microsoft.com/office/drawing/2016/5/11/chartex" xmlns:cx6="http://schemas.microsoft.com/office/drawing/2016/5/12/chartex" xmlns:cx7="http://schemas.microsoft.com/office/drawing/2016/5/13/chartex" xmlns:cx8="http://schemas.microsoft.com/office/drawing/2016/5/14/chartex" xmlns:mc="http://schemas.openxmlformats.org/markup-compatibility/2006" xmlns:aink="http://schemas.microsoft.com/office/drawing/2016/ink" xmlns:am3d="http://schemas.microsoft.com/office/drawing/2017/model3d" xmlns:o="urn:schemas-microsoft-com:office:office" xmlns:oel="http://schemas.microsoft.com/office/2019/extlst" xmlns:r="http://schemas.openxmlformats.org/officeDocument/2006/relationships" xmlns:m="http://schemas.openxmlformats.org/officeDocument/2006/math" xmlns:v="urn:schemas-microsoft-com:vml" xmlns:wp14="http://schemas.microsoft.com/office/word/2010/wordprocessingDrawing" xmlns:wp="http://schemas.openxmlformats.org/drawingml/2006/wordprocessingDrawing" xmlns:w10="urn:schemas-microsoft-com:office:word" xmlns:w="http://schemas.openxmlformats.org/wordprocessingml/2006/main" xmlns:w14="http://schemas.microsoft.com/office/word/2010/wordml" xmlns:w15="http://schemas.microsoft.com/office/word/2012/wordml" xmlns:w16cex="http://schemas.microsoft.com/office/word/2018/wordml/cex" xmlns:w16cid="http://schemas.microsoft.com/office/word/2016/wordml/cid" xmlns:w16="http://schemas.microsoft.com/office/word/2018/wordml" xmlns:w16du="http://schemas.microsoft.com/office/word/2023/wordml/word16du" xmlns:w16sdtdh="http://schemas.microsoft.com/office/word/2020/wordml/sdtdatahash" xmlns:w16sdtfl="http://schemas.microsoft.com/office/word/2024/wordml/sdtformatlock" xmlns:w16se="http://schemas.microsoft.com/office/word/2015/wordml/symex" xmlns:wpg="http://schemas.microsoft.com/office/word/2010/wordprocessingGroup" xmlns:wpi="http://schemas.microsoft.com/office/word/2010/wordprocessingInk" xmlns:wne="http://schemas.microsoft.com/office/word/2006/wordml" xmlns:wps="http://schemas.microsoft.com/office/word/2010/wordprocessingShape" mc:Ignorable="w14 w15 w16se w16cid w16 w16cex w16sdtdh w16sdtfl w16du wp14">
   <w:docParts>
     <w:docPart>
       <w:docPartPr>
@@ -17775,7 +17825,7 @@
       <w:docPartBody>
         <w:p>
           <w:pPr>
-            <w:pStyle w:val="76A979D490ED478088E583E9224FDC74"/>
+            <w:pStyle w:val="76A979D490ED478088E583E9224FDC741"/>
           </w:pPr>
           <w:r>
             <w:rPr>
@@ -17807,7 +17857,7 @@
       <w:docPartBody>
         <w:p>
           <w:pPr>
-            <w:pStyle w:val="88E6C2B122B54A44A5EE63724112607C"/>
+            <w:pStyle w:val="88E6C2B122B54A44A5EE63724112607C1"/>
           </w:pPr>
           <w:r>
             <w:rPr>
@@ -17836,7 +17886,7 @@
       <w:docPartBody>
         <w:p>
           <w:pPr>
-            <w:pStyle w:val="A1FD1D52DBCD47B1A761F33A002F5885"/>
+            <w:pStyle w:val="A1FD1D52DBCD47B1A761F33A002F58851"/>
           </w:pPr>
           <w:r>
             <w:rPr>
@@ -17866,7 +17916,7 @@
       <w:docPartBody>
         <w:p>
           <w:pPr>
-            <w:pStyle w:val="5263167169884FD4BA307CDFDC664716"/>
+            <w:pStyle w:val="5263167169884FD4BA307CDFDC6647161"/>
           </w:pPr>
           <w:r>
             <w:rPr>
@@ -17895,7 +17945,7 @@
       <w:docPartBody>
         <w:p>
           <w:pPr>
-            <w:pStyle w:val="A180639606504698B96388E663B5AB3F"/>
+            <w:pStyle w:val="A180639606504698B96388E663B5AB3F1"/>
           </w:pPr>
           <w:r>
             <w:rPr>
@@ -17924,7 +17974,7 @@
       <w:docPartBody>
         <w:p>
           <w:pPr>
-            <w:pStyle w:val="D5A43A9B1E49491CAA21D4C273CFAC8D1"/>
+            <w:pStyle w:val="D5A43A9B1E49491CAA21D4C273CFAC8D"/>
           </w:pPr>
           <w:r>
             <w:rPr>
@@ -17953,7 +18003,7 @@
       <w:docPartBody>
         <w:p>
           <w:pPr>
-            <w:pStyle w:val="79E68813557447948555AAF61A202C8A1"/>
+            <w:pStyle w:val="79E68813557447948555AAF61A202C8A"/>
           </w:pPr>
           <w:r>
             <w:rPr>
@@ -17982,7 +18032,7 @@
       <w:docPartBody>
         <w:p>
           <w:pPr>
-            <w:pStyle w:val="8F80E1723F774611836FDFB35A40BD9B1"/>
+            <w:pStyle w:val="8F80E1723F774611836FDFB35A40BD9B"/>
           </w:pPr>
           <w:r>
             <w:rPr>
@@ -18012,7 +18062,7 @@
       <w:docPartBody>
         <w:p>
           <w:pPr>
-            <w:pStyle w:val="E49884F847874509BF53495EC1E49D491"/>
+            <w:pStyle w:val="E49884F847874509BF53495EC1E49D49"/>
           </w:pPr>
           <w:r>
             <w:rPr>
@@ -18041,7 +18091,7 @@
       <w:docPartBody>
         <w:p>
           <w:pPr>
-            <w:pStyle w:val="C6EB278CD1704CBDBE847912548187641"/>
+            <w:pStyle w:val="C6EB278CD1704CBDBE84791254818764"/>
           </w:pPr>
           <w:r>
             <w:rPr>
@@ -18070,7 +18120,7 @@
       <w:docPartBody>
         <w:p>
           <w:pPr>
-            <w:pStyle w:val="2DE5343C3E5844A6B150CF244BEDE0531"/>
+            <w:pStyle w:val="2DE5343C3E5844A6B150CF244BEDE053"/>
           </w:pPr>
           <w:r>
             <w:rPr>
@@ -18099,7 +18149,7 @@
       <w:docPartBody>
         <w:p>
           <w:pPr>
-            <w:pStyle w:val="1B13E575BC6D4FF4AB5D4C1DFB3786B41"/>
+            <w:pStyle w:val="1B13E575BC6D4FF4AB5D4C1DFB3786B4"/>
           </w:pPr>
           <w:r>
             <w:rPr>
@@ -18128,7 +18178,7 @@
       <w:docPartBody>
         <w:p>
           <w:pPr>
-            <w:pStyle w:val="207A677C38764BE9A399D536A56AD62D1"/>
+            <w:pStyle w:val="207A677C38764BE9A399D536A56AD62D"/>
           </w:pPr>
           <w:r>
             <w:rPr>
@@ -18157,7 +18207,7 @@
       <w:docPartBody>
         <w:p>
           <w:pPr>
-            <w:pStyle w:val="C13D514652DD4F39A895AFE92DCD5C681"/>
+            <w:pStyle w:val="C13D514652DD4F39A895AFE92DCD5C68"/>
           </w:pPr>
           <w:r>
             <w:rPr>
@@ -18188,7 +18238,7 @@
       <w:docPartBody>
         <w:p>
           <w:pPr>
-            <w:pStyle w:val="74A3798F35E54BAE92151FD92E43C4A61"/>
+            <w:pStyle w:val="74A3798F35E54BAE92151FD92E43C4A6"/>
           </w:pPr>
           <w:r>
             <w:rPr>
@@ -18217,7 +18267,7 @@
       <w:docPartBody>
         <w:p>
           <w:pPr>
-            <w:pStyle w:val="4AFE9829630944CCAA8DE6FC91661B581"/>
+            <w:pStyle w:val="4AFE9829630944CCAA8DE6FC91661B58"/>
           </w:pPr>
           <w:r>
             <w:rPr>
@@ -18247,7 +18297,7 @@
       <w:docPartBody>
         <w:p>
           <w:pPr>
-            <w:pStyle w:val="26F004D168D14AB3B25EB8A64EC34B0D1"/>
+            <w:pStyle w:val="26F004D168D14AB3B25EB8A64EC34B0D"/>
           </w:pPr>
           <w:r>
             <w:rPr>
@@ -18276,7 +18326,7 @@
       <w:docPartBody>
         <w:p>
           <w:pPr>
-            <w:pStyle w:val="9FB8AD63DC1E4B1A8182965409FAE3411"/>
+            <w:pStyle w:val="9FB8AD63DC1E4B1A8182965409FAE341"/>
           </w:pPr>
           <w:r>
             <w:rPr>
@@ -18306,7 +18356,7 @@
       <w:docPartBody>
         <w:p>
           <w:pPr>
-            <w:pStyle w:val="60D278276478419586CC348C6D6D692C1"/>
+            <w:pStyle w:val="60D278276478419586CC348C6D6D692C"/>
           </w:pPr>
           <w:r>
             <w:rPr>
@@ -18335,7 +18385,7 @@
       <w:docPartBody>
         <w:p>
           <w:pPr>
-            <w:pStyle w:val="5191FCBEB67E487C8ECD99605A3151C91"/>
+            <w:pStyle w:val="5191FCBEB67E487C8ECD99605A3151C9"/>
           </w:pPr>
           <w:r>
             <w:rPr>
@@ -18364,7 +18414,7 @@
       <w:docPartBody>
         <w:p>
           <w:pPr>
-            <w:pStyle w:val="BAF60F6589B84E0D92E8D2BF0CC2B96E1"/>
+            <w:pStyle w:val="BAF60F6589B84E0D92E8D2BF0CC2B96E"/>
           </w:pPr>
           <w:r>
             <w:rPr>
@@ -18393,7 +18443,7 @@
       <w:docPartBody>
         <w:p>
           <w:pPr>
-            <w:pStyle w:val="9D4DE7BCC667470F9F00F23B1FD614491"/>
+            <w:pStyle w:val="9D4DE7BCC667470F9F00F23B1FD61449"/>
           </w:pPr>
           <w:r>
             <w:rPr>
@@ -18422,7 +18472,7 @@
       <w:docPartBody>
         <w:p>
           <w:pPr>
-            <w:pStyle w:val="886E5B9C5500423392DB9BE8694BF3F6"/>
+            <w:pStyle w:val="886E5B9C5500423392DB9BE8694BF3F61"/>
           </w:pPr>
           <w:r>
             <w:rPr>
@@ -18454,7 +18504,7 @@
       <w:docPartBody>
         <w:p>
           <w:pPr>
-            <w:pStyle w:val="C84818893C63427FAC1F69959CA0D53C"/>
+            <w:pStyle w:val="C84818893C63427FAC1F69959CA0D53C1"/>
           </w:pPr>
           <w:r>
             <w:rPr>
@@ -18484,14 +18534,28 @@
       <w:docPartBody>
         <w:p>
           <w:pPr>
-            <w:pStyle w:val="2D9056C5B6704EF5ABDCFEFE901315C21"/>
+            <w:pStyle w:val="2D9056C5B6704EF5ABDCFEFE901315C2"/>
           </w:pPr>
           <w:r>
             <w:rPr>
               <w:rFonts w:eastAsiaTheme="minorHAnsi"/>
               <w:shd w:val="clear" w:color="auto" w:fill="FAE2D5" w:themeFill="accent2" w:themeFillTint="33"/>
             </w:rPr>
-            <w:t>Beschlussbehöre eingeben</w:t>
+            <w:t>Beschlussbehör</w:t>
+          </w:r>
+          <w:r>
+            <w:rPr>
+              <w:rFonts w:eastAsiaTheme="minorHAnsi"/>
+              <w:shd w:val="clear" w:color="auto" w:fill="FAE2D5" w:themeFill="accent2" w:themeFillTint="33"/>
+            </w:rPr>
+            <w:t>d</w:t>
+          </w:r>
+          <w:r>
+            <w:rPr>
+              <w:rFonts w:eastAsiaTheme="minorHAnsi"/>
+              <w:shd w:val="clear" w:color="auto" w:fill="FAE2D5" w:themeFill="accent2" w:themeFillTint="33"/>
+            </w:rPr>
+            <w:t>e eingeben</w:t>
           </w:r>
         </w:p>
       </w:docPartBody>
@@ -18514,7 +18578,7 @@
       <w:docPartBody>
         <w:p>
           <w:pPr>
-            <w:pStyle w:val="39370F559F6E4DA9884457D62EE7A77C"/>
+            <w:pStyle w:val="39370F559F6E4DA9884457D62EE7A77C1"/>
           </w:pPr>
           <w:r>
             <w:rPr>
@@ -18530,7 +18594,7 @@
 </file>
 
 <file path=word/glossary/fontTable.xml><?xml version="1.0" encoding="utf-8"?>
-<w:fonts xmlns:mc="http://schemas.openxmlformats.org/markup-compatibility/2006" xmlns:r="http://schemas.openxmlformats.org/officeDocument/2006/relationships" xmlns:w="http://schemas.openxmlformats.org/wordprocessingml/2006/main" xmlns:w14="http://schemas.microsoft.com/office/word/2010/wordml" xmlns:w15="http://schemas.microsoft.com/office/word/2012/wordml" xmlns:w16cex="http://schemas.microsoft.com/office/word/2018/wordml/cex" xmlns:w16cid="http://schemas.microsoft.com/office/word/2016/wordml/cid" xmlns:w16="http://schemas.microsoft.com/office/word/2018/wordml" xmlns:w16du="http://schemas.microsoft.com/office/word/2023/wordml/word16du" xmlns:w16sdtdh="http://schemas.microsoft.com/office/word/2020/wordml/sdtdatahash" xmlns:w16se="http://schemas.microsoft.com/office/word/2015/wordml/symex" mc:Ignorable="w14 w15 w16se w16cid w16 w16cex w16sdtdh w16du">
+<w:fonts xmlns:mc="http://schemas.openxmlformats.org/markup-compatibility/2006" xmlns:r="http://schemas.openxmlformats.org/officeDocument/2006/relationships" xmlns:w="http://schemas.openxmlformats.org/wordprocessingml/2006/main" xmlns:w14="http://schemas.microsoft.com/office/word/2010/wordml" xmlns:w15="http://schemas.microsoft.com/office/word/2012/wordml" xmlns:w16cex="http://schemas.microsoft.com/office/word/2018/wordml/cex" xmlns:w16cid="http://schemas.microsoft.com/office/word/2016/wordml/cid" xmlns:w16="http://schemas.microsoft.com/office/word/2018/wordml" xmlns:w16du="http://schemas.microsoft.com/office/word/2023/wordml/word16du" xmlns:w16sdtdh="http://schemas.microsoft.com/office/word/2020/wordml/sdtdatahash" xmlns:w16sdtfl="http://schemas.microsoft.com/office/word/2024/wordml/sdtformatlock" xmlns:w16se="http://schemas.microsoft.com/office/word/2015/wordml/symex" mc:Ignorable="w14 w15 w16se w16cid w16 w16cex w16sdtdh w16sdtfl w16du">
   <w:font w:name="Arial">
     <w:panose1 w:val="020B0604020202020204"/>
     <w:charset w:val="00"/>
@@ -18603,7 +18667,7 @@
 </file>
 
 <file path=word/glossary/numbering.xml><?xml version="1.0" encoding="utf-8"?>
-<w:numbering xmlns:wpc="http://schemas.microsoft.com/office/word/2010/wordprocessingCanvas" xmlns:cx="http://schemas.microsoft.com/office/drawing/2014/chartex" xmlns:cx1="http://schemas.microsoft.com/office/drawing/2015/9/8/chartex" xmlns:cx2="http://schemas.microsoft.com/office/drawing/2015/10/21/chartex" xmlns:cx3="http://schemas.microsoft.com/office/drawing/2016/5/9/chartex" xmlns:cx4="http://schemas.microsoft.com/office/drawing/2016/5/10/chartex" xmlns:cx5="http://schemas.microsoft.com/office/drawing/2016/5/11/chartex" xmlns:cx6="http://schemas.microsoft.com/office/drawing/2016/5/12/chartex" xmlns:cx7="http://schemas.microsoft.com/office/drawing/2016/5/13/chartex" xmlns:cx8="http://schemas.microsoft.com/office/drawing/2016/5/14/chartex" xmlns:mc="http://schemas.openxmlformats.org/markup-compatibility/2006" xmlns:aink="http://schemas.microsoft.com/office/drawing/2016/ink" xmlns:am3d="http://schemas.microsoft.com/office/drawing/2017/model3d" xmlns:o="urn:schemas-microsoft-com:office:office" xmlns:oel="http://schemas.microsoft.com/office/2019/extlst" xmlns:r="http://schemas.openxmlformats.org/officeDocument/2006/relationships" xmlns:m="http://schemas.openxmlformats.org/officeDocument/2006/math" xmlns:v="urn:schemas-microsoft-com:vml" xmlns:wp14="http://schemas.microsoft.com/office/word/2010/wordprocessingDrawing" xmlns:wp="http://schemas.openxmlformats.org/drawingml/2006/wordprocessingDrawing" xmlns:w10="urn:schemas-microsoft-com:office:word" xmlns:w="http://schemas.openxmlformats.org/wordprocessingml/2006/main" xmlns:w14="http://schemas.microsoft.com/office/word/2010/wordml" xmlns:w15="http://schemas.microsoft.com/office/word/2012/wordml" xmlns:w16cex="http://schemas.microsoft.com/office/word/2018/wordml/cex" xmlns:w16cid="http://schemas.microsoft.com/office/word/2016/wordml/cid" xmlns:w16="http://schemas.microsoft.com/office/word/2018/wordml" xmlns:w16du="http://schemas.microsoft.com/office/word/2023/wordml/word16du" xmlns:w16sdtdh="http://schemas.microsoft.com/office/word/2020/wordml/sdtdatahash" xmlns:w16se="http://schemas.microsoft.com/office/word/2015/wordml/symex" xmlns:wpg="http://schemas.microsoft.com/office/word/2010/wordprocessingGroup" xmlns:wpi="http://schemas.microsoft.com/office/word/2010/wordprocessingInk" xmlns:wne="http://schemas.microsoft.com/office/word/2006/wordml" xmlns:wps="http://schemas.microsoft.com/office/word/2010/wordprocessingShape" mc:Ignorable="w14 w15 w16se w16cid w16 w16cex w16sdtdh w16du wp14">
+<w:numbering xmlns:wpc="http://schemas.microsoft.com/office/word/2010/wordprocessingCanvas" xmlns:cx="http://schemas.microsoft.com/office/drawing/2014/chartex" xmlns:cx1="http://schemas.microsoft.com/office/drawing/2015/9/8/chartex" xmlns:cx2="http://schemas.microsoft.com/office/drawing/2015/10/21/chartex" xmlns:cx3="http://schemas.microsoft.com/office/drawing/2016/5/9/chartex" xmlns:cx4="http://schemas.microsoft.com/office/drawing/2016/5/10/chartex" xmlns:cx5="http://schemas.microsoft.com/office/drawing/2016/5/11/chartex" xmlns:cx6="http://schemas.microsoft.com/office/drawing/2016/5/12/chartex" xmlns:cx7="http://schemas.microsoft.com/office/drawing/2016/5/13/chartex" xmlns:cx8="http://schemas.microsoft.com/office/drawing/2016/5/14/chartex" xmlns:mc="http://schemas.openxmlformats.org/markup-compatibility/2006" xmlns:aink="http://schemas.microsoft.com/office/drawing/2016/ink" xmlns:am3d="http://schemas.microsoft.com/office/drawing/2017/model3d" xmlns:o="urn:schemas-microsoft-com:office:office" xmlns:oel="http://schemas.microsoft.com/office/2019/extlst" xmlns:r="http://schemas.openxmlformats.org/officeDocument/2006/relationships" xmlns:m="http://schemas.openxmlformats.org/officeDocument/2006/math" xmlns:v="urn:schemas-microsoft-com:vml" xmlns:wp14="http://schemas.microsoft.com/office/word/2010/wordprocessingDrawing" xmlns:wp="http://schemas.openxmlformats.org/drawingml/2006/wordprocessingDrawing" xmlns:w10="urn:schemas-microsoft-com:office:word" xmlns:w="http://schemas.openxmlformats.org/wordprocessingml/2006/main" xmlns:w14="http://schemas.microsoft.com/office/word/2010/wordml" xmlns:w15="http://schemas.microsoft.com/office/word/2012/wordml" xmlns:w16cex="http://schemas.microsoft.com/office/word/2018/wordml/cex" xmlns:w16cid="http://schemas.microsoft.com/office/word/2016/wordml/cid" xmlns:w16="http://schemas.microsoft.com/office/word/2018/wordml" xmlns:w16du="http://schemas.microsoft.com/office/word/2023/wordml/word16du" xmlns:w16sdtdh="http://schemas.microsoft.com/office/word/2020/wordml/sdtdatahash" xmlns:w16sdtfl="http://schemas.microsoft.com/office/word/2024/wordml/sdtformatlock" xmlns:w16se="http://schemas.microsoft.com/office/word/2015/wordml/symex" xmlns:wpg="http://schemas.microsoft.com/office/word/2010/wordprocessingGroup" xmlns:wpi="http://schemas.microsoft.com/office/word/2010/wordprocessingInk" xmlns:wne="http://schemas.microsoft.com/office/word/2006/wordml" xmlns:wps="http://schemas.microsoft.com/office/word/2010/wordprocessingShape" mc:Ignorable="w14 w15 w16se w16cid w16 w16cex w16sdtdh w16sdtfl w16du wp14">
   <w:abstractNum w:abstractNumId="0" w15:restartNumberingAfterBreak="0">
     <w:nsid w:val="253218F3"/>
     <w:multiLevelType w:val="multilevel"/>
@@ -18724,7 +18788,6 @@
     <w:lvl w:ilvl="0">
       <w:start w:val="1"/>
       <w:numFmt w:val="decimal"/>
-      <w:pStyle w:val="207A677C38764BE9A399D536A56AD62D1"/>
       <w:lvlText w:val="%1."/>
       <w:lvlJc w:val="left"/>
       <w:pPr>
@@ -18838,7 +18901,6 @@
     <w:lvl w:ilvl="0">
       <w:start w:val="1"/>
       <w:numFmt w:val="decimal"/>
-      <w:pStyle w:val="79E68813557447948555AAF61A202C8A1"/>
       <w:lvlText w:val="%1."/>
       <w:lvlJc w:val="left"/>
       <w:pPr>
@@ -18988,7 +19050,7 @@
 </file>
 
 <file path=word/glossary/settings.xml><?xml version="1.0" encoding="utf-8"?>
-<w:settings xmlns:mc="http://schemas.openxmlformats.org/markup-compatibility/2006" xmlns:o="urn:schemas-microsoft-com:office:office" xmlns:r="http://schemas.openxmlformats.org/officeDocument/2006/relationships" xmlns:m="http://schemas.openxmlformats.org/officeDocument/2006/math" xmlns:v="urn:schemas-microsoft-com:vml" xmlns:w10="urn:schemas-microsoft-com:office:word" xmlns:w="http://schemas.openxmlformats.org/wordprocessingml/2006/main" xmlns:w14="http://schemas.microsoft.com/office/word/2010/wordml" xmlns:w15="http://schemas.microsoft.com/office/word/2012/wordml" xmlns:w16cex="http://schemas.microsoft.com/office/word/2018/wordml/cex" xmlns:w16cid="http://schemas.microsoft.com/office/word/2016/wordml/cid" xmlns:w16="http://schemas.microsoft.com/office/word/2018/wordml" xmlns:w16du="http://schemas.microsoft.com/office/word/2023/wordml/word16du" xmlns:w16sdtdh="http://schemas.microsoft.com/office/word/2020/wordml/sdtdatahash" xmlns:w16se="http://schemas.microsoft.com/office/word/2015/wordml/symex" xmlns:sl="http://schemas.openxmlformats.org/schemaLibrary/2006/main" mc:Ignorable="w14 w15 w16se w16cid w16 w16cex w16sdtdh w16du">
+<w:settings xmlns:mc="http://schemas.openxmlformats.org/markup-compatibility/2006" xmlns:o="urn:schemas-microsoft-com:office:office" xmlns:r="http://schemas.openxmlformats.org/officeDocument/2006/relationships" xmlns:m="http://schemas.openxmlformats.org/officeDocument/2006/math" xmlns:v="urn:schemas-microsoft-com:vml" xmlns:w10="urn:schemas-microsoft-com:office:word" xmlns:w="http://schemas.openxmlformats.org/wordprocessingml/2006/main" xmlns:w14="http://schemas.microsoft.com/office/word/2010/wordml" xmlns:w15="http://schemas.microsoft.com/office/word/2012/wordml" xmlns:w16cex="http://schemas.microsoft.com/office/word/2018/wordml/cex" xmlns:w16cid="http://schemas.microsoft.com/office/word/2016/wordml/cid" xmlns:w16="http://schemas.microsoft.com/office/word/2018/wordml" xmlns:w16du="http://schemas.microsoft.com/office/word/2023/wordml/word16du" xmlns:w16sdtdh="http://schemas.microsoft.com/office/word/2020/wordml/sdtdatahash" xmlns:w16sdtfl="http://schemas.microsoft.com/office/word/2024/wordml/sdtformatlock" xmlns:w16se="http://schemas.microsoft.com/office/word/2015/wordml/symex" xmlns:sl="http://schemas.openxmlformats.org/schemaLibrary/2006/main" mc:Ignorable="w14 w15 w16se w16cid w16 w16cex w16sdtdh w16sdtfl w16du">
   <w:view w:val="normal"/>
   <w:defaultTabStop w:val="708"/>
   <w:hyphenationZone w:val="425"/>
@@ -19012,11 +19074,13 @@
     <w:rsid w:val="002F6A46"/>
     <w:rsid w:val="0035281A"/>
     <w:rsid w:val="003E03AD"/>
+    <w:rsid w:val="004C2BAF"/>
     <w:rsid w:val="004D6844"/>
     <w:rsid w:val="005A2364"/>
     <w:rsid w:val="006D721E"/>
     <w:rsid w:val="00722E87"/>
     <w:rsid w:val="007D08C9"/>
+    <w:rsid w:val="009852EF"/>
     <w:rsid w:val="00996E85"/>
     <w:rsid w:val="009E2CEF"/>
     <w:rsid w:val="00AE68D2"/>
@@ -19030,6 +19094,7 @@
     <w:rsid w:val="00F03AC1"/>
     <w:rsid w:val="00F155E1"/>
     <w:rsid w:val="00F94070"/>
+    <w:rsid w:val="00FB5446"/>
   </w:rsids>
   <m:mathPr>
     <m:mathFont m:val="Cambria Math"/>
@@ -19053,7 +19118,7 @@
 </file>
 
 <file path=word/glossary/styles.xml><?xml version="1.0" encoding="utf-8"?>
-<w:styles xmlns:mc="http://schemas.openxmlformats.org/markup-compatibility/2006" xmlns:r="http://schemas.openxmlformats.org/officeDocument/2006/relationships" xmlns:w="http://schemas.openxmlformats.org/wordprocessingml/2006/main" xmlns:w14="http://schemas.microsoft.com/office/word/2010/wordml" xmlns:w15="http://schemas.microsoft.com/office/word/2012/wordml" xmlns:w16cex="http://schemas.microsoft.com/office/word/2018/wordml/cex" xmlns:w16cid="http://schemas.microsoft.com/office/word/2016/wordml/cid" xmlns:w16="http://schemas.microsoft.com/office/word/2018/wordml" xmlns:w16du="http://schemas.microsoft.com/office/word/2023/wordml/word16du" xmlns:w16sdtdh="http://schemas.microsoft.com/office/word/2020/wordml/sdtdatahash" xmlns:w16se="http://schemas.microsoft.com/office/word/2015/wordml/symex" mc:Ignorable="w14 w15 w16se w16cid w16 w16cex w16sdtdh w16du">
+<w:styles xmlns:mc="http://schemas.openxmlformats.org/markup-compatibility/2006" xmlns:r="http://schemas.openxmlformats.org/officeDocument/2006/relationships" xmlns:w="http://schemas.openxmlformats.org/wordprocessingml/2006/main" xmlns:w14="http://schemas.microsoft.com/office/word/2010/wordml" xmlns:w15="http://schemas.microsoft.com/office/word/2012/wordml" xmlns:w16cex="http://schemas.microsoft.com/office/word/2018/wordml/cex" xmlns:w16cid="http://schemas.microsoft.com/office/word/2016/wordml/cid" xmlns:w16="http://schemas.microsoft.com/office/word/2018/wordml" xmlns:w16du="http://schemas.microsoft.com/office/word/2023/wordml/word16du" xmlns:w16sdtdh="http://schemas.microsoft.com/office/word/2020/wordml/sdtdatahash" xmlns:w16sdtfl="http://schemas.microsoft.com/office/word/2024/wordml/sdtformatlock" xmlns:w16se="http://schemas.microsoft.com/office/word/2015/wordml/symex" mc:Ignorable="w14 w15 w16se w16cid w16 w16cex w16sdtdh w16sdtfl w16du">
   <w:docDefaults>
     <w:rPrDefault>
       <w:rPr>
@@ -19485,14 +19550,14 @@
     <w:basedOn w:val="Absatz-Standardschriftart"/>
     <w:uiPriority w:val="99"/>
     <w:semiHidden/>
-    <w:rsid w:val="00DE739C"/>
+    <w:rsid w:val="009852EF"/>
     <w:rPr>
       <w:color w:val="666666"/>
     </w:rPr>
   </w:style>
-  <w:style w:type="paragraph" w:customStyle="1" w:styleId="76A979D490ED478088E583E9224FDC74">
-    <w:name w:val="76A979D490ED478088E583E9224FDC74"/>
-    <w:rsid w:val="00DE739C"/>
+  <w:style w:type="paragraph" w:customStyle="1" w:styleId="76A979D490ED478088E583E9224FDC741">
+    <w:name w:val="76A979D490ED478088E583E9224FDC741"/>
+    <w:rsid w:val="009852EF"/>
     <w:pPr>
       <w:tabs>
         <w:tab w:val="center" w:pos="4536"/>
@@ -19514,9 +19579,9 @@
       <w14:ligatures w14:val="none"/>
     </w:rPr>
   </w:style>
-  <w:style w:type="paragraph" w:customStyle="1" w:styleId="2D9056C5B6704EF5ABDCFEFE901315C21">
-    <w:name w:val="2D9056C5B6704EF5ABDCFEFE901315C21"/>
-    <w:rsid w:val="00DE739C"/>
+  <w:style w:type="paragraph" w:customStyle="1" w:styleId="2D9056C5B6704EF5ABDCFEFE901315C2">
+    <w:name w:val="2D9056C5B6704EF5ABDCFEFE901315C2"/>
+    <w:rsid w:val="009852EF"/>
     <w:pPr>
       <w:overflowPunct w:val="0"/>
       <w:autoSpaceDE w:val="0"/>
@@ -19534,9 +19599,9 @@
       <w14:ligatures w14:val="none"/>
     </w:rPr>
   </w:style>
-  <w:style w:type="paragraph" w:customStyle="1" w:styleId="D5A43A9B1E49491CAA21D4C273CFAC8D1">
-    <w:name w:val="D5A43A9B1E49491CAA21D4C273CFAC8D1"/>
-    <w:rsid w:val="00DE739C"/>
+  <w:style w:type="paragraph" w:customStyle="1" w:styleId="D5A43A9B1E49491CAA21D4C273CFAC8D">
+    <w:name w:val="D5A43A9B1E49491CAA21D4C273CFAC8D"/>
+    <w:rsid w:val="009852EF"/>
     <w:pPr>
       <w:overflowPunct w:val="0"/>
       <w:autoSpaceDE w:val="0"/>
@@ -19554,36 +19619,9 @@
       <w14:ligatures w14:val="none"/>
     </w:rPr>
   </w:style>
-  <w:style w:type="paragraph" w:customStyle="1" w:styleId="79E68813557447948555AAF61A202C8A1">
-    <w:name w:val="79E68813557447948555AAF61A202C8A1"/>
-    <w:rsid w:val="00DE739C"/>
-    <w:pPr>
-      <w:numPr>
-        <w:numId w:val="4"/>
-      </w:numPr>
-      <w:tabs>
-        <w:tab w:val="clear" w:pos="720"/>
-      </w:tabs>
-      <w:overflowPunct w:val="0"/>
-      <w:autoSpaceDE w:val="0"/>
-      <w:autoSpaceDN w:val="0"/>
-      <w:adjustRightInd w:val="0"/>
-      <w:spacing w:before="240" w:after="0" w:line="259" w:lineRule="auto"/>
-      <w:ind w:left="360" w:hanging="360"/>
-      <w:textAlignment w:val="baseline"/>
-    </w:pPr>
-    <w:rPr>
-      <w:rFonts w:ascii="Arial" w:eastAsia="Times New Roman" w:hAnsi="Arial" w:cs="Times New Roman"/>
-      <w:kern w:val="0"/>
-      <w:sz w:val="22"/>
-      <w:szCs w:val="20"/>
-      <w:lang w:eastAsia="de-DE"/>
-      <w14:ligatures w14:val="none"/>
-    </w:rPr>
-  </w:style>
-  <w:style w:type="paragraph" w:customStyle="1" w:styleId="8F80E1723F774611836FDFB35A40BD9B1">
-    <w:name w:val="8F80E1723F774611836FDFB35A40BD9B1"/>
-    <w:rsid w:val="00DE739C"/>
+  <w:style w:type="paragraph" w:customStyle="1" w:styleId="79E68813557447948555AAF61A202C8A">
+    <w:name w:val="79E68813557447948555AAF61A202C8A"/>
+    <w:rsid w:val="009852EF"/>
     <w:pPr>
       <w:overflowPunct w:val="0"/>
       <w:autoSpaceDE w:val="0"/>
@@ -19602,9 +19640,9 @@
       <w14:ligatures w14:val="none"/>
     </w:rPr>
   </w:style>
-  <w:style w:type="paragraph" w:customStyle="1" w:styleId="88E6C2B122B54A44A5EE63724112607C">
-    <w:name w:val="88E6C2B122B54A44A5EE63724112607C"/>
-    <w:rsid w:val="00DE739C"/>
+  <w:style w:type="paragraph" w:customStyle="1" w:styleId="8F80E1723F774611836FDFB35A40BD9B">
+    <w:name w:val="8F80E1723F774611836FDFB35A40BD9B"/>
+    <w:rsid w:val="009852EF"/>
     <w:pPr>
       <w:overflowPunct w:val="0"/>
       <w:autoSpaceDE w:val="0"/>
@@ -19623,9 +19661,9 @@
       <w14:ligatures w14:val="none"/>
     </w:rPr>
   </w:style>
-  <w:style w:type="paragraph" w:customStyle="1" w:styleId="A1FD1D52DBCD47B1A761F33A002F5885">
-    <w:name w:val="A1FD1D52DBCD47B1A761F33A002F5885"/>
-    <w:rsid w:val="00DE739C"/>
+  <w:style w:type="paragraph" w:customStyle="1" w:styleId="88E6C2B122B54A44A5EE63724112607C1">
+    <w:name w:val="88E6C2B122B54A44A5EE63724112607C1"/>
+    <w:rsid w:val="009852EF"/>
     <w:pPr>
       <w:overflowPunct w:val="0"/>
       <w:autoSpaceDE w:val="0"/>
@@ -19644,9 +19682,9 @@
       <w14:ligatures w14:val="none"/>
     </w:rPr>
   </w:style>
-  <w:style w:type="paragraph" w:customStyle="1" w:styleId="74A3798F35E54BAE92151FD92E43C4A61">
-    <w:name w:val="74A3798F35E54BAE92151FD92E43C4A61"/>
-    <w:rsid w:val="00DE739C"/>
+  <w:style w:type="paragraph" w:customStyle="1" w:styleId="A1FD1D52DBCD47B1A761F33A002F58851">
+    <w:name w:val="A1FD1D52DBCD47B1A761F33A002F58851"/>
+    <w:rsid w:val="009852EF"/>
     <w:pPr>
       <w:overflowPunct w:val="0"/>
       <w:autoSpaceDE w:val="0"/>
@@ -19665,9 +19703,9 @@
       <w14:ligatures w14:val="none"/>
     </w:rPr>
   </w:style>
-  <w:style w:type="paragraph" w:customStyle="1" w:styleId="4AFE9829630944CCAA8DE6FC91661B581">
-    <w:name w:val="4AFE9829630944CCAA8DE6FC91661B581"/>
-    <w:rsid w:val="00DE739C"/>
+  <w:style w:type="paragraph" w:customStyle="1" w:styleId="74A3798F35E54BAE92151FD92E43C4A6">
+    <w:name w:val="74A3798F35E54BAE92151FD92E43C4A6"/>
+    <w:rsid w:val="009852EF"/>
     <w:pPr>
       <w:overflowPunct w:val="0"/>
       <w:autoSpaceDE w:val="0"/>
@@ -19686,9 +19724,9 @@
       <w14:ligatures w14:val="none"/>
     </w:rPr>
   </w:style>
-  <w:style w:type="paragraph" w:customStyle="1" w:styleId="26F004D168D14AB3B25EB8A64EC34B0D1">
-    <w:name w:val="26F004D168D14AB3B25EB8A64EC34B0D1"/>
-    <w:rsid w:val="00DE739C"/>
+  <w:style w:type="paragraph" w:customStyle="1" w:styleId="4AFE9829630944CCAA8DE6FC91661B58">
+    <w:name w:val="4AFE9829630944CCAA8DE6FC91661B58"/>
+    <w:rsid w:val="009852EF"/>
     <w:pPr>
       <w:overflowPunct w:val="0"/>
       <w:autoSpaceDE w:val="0"/>
@@ -19707,9 +19745,9 @@
       <w14:ligatures w14:val="none"/>
     </w:rPr>
   </w:style>
-  <w:style w:type="paragraph" w:customStyle="1" w:styleId="9FB8AD63DC1E4B1A8182965409FAE3411">
-    <w:name w:val="9FB8AD63DC1E4B1A8182965409FAE3411"/>
-    <w:rsid w:val="00DE739C"/>
+  <w:style w:type="paragraph" w:customStyle="1" w:styleId="26F004D168D14AB3B25EB8A64EC34B0D">
+    <w:name w:val="26F004D168D14AB3B25EB8A64EC34B0D"/>
+    <w:rsid w:val="009852EF"/>
     <w:pPr>
       <w:overflowPunct w:val="0"/>
       <w:autoSpaceDE w:val="0"/>
@@ -19728,9 +19766,30 @@
       <w14:ligatures w14:val="none"/>
     </w:rPr>
   </w:style>
-  <w:style w:type="paragraph" w:customStyle="1" w:styleId="E49884F847874509BF53495EC1E49D491">
-    <w:name w:val="E49884F847874509BF53495EC1E49D491"/>
-    <w:rsid w:val="00DE739C"/>
+  <w:style w:type="paragraph" w:customStyle="1" w:styleId="9FB8AD63DC1E4B1A8182965409FAE341">
+    <w:name w:val="9FB8AD63DC1E4B1A8182965409FAE341"/>
+    <w:rsid w:val="009852EF"/>
+    <w:pPr>
+      <w:overflowPunct w:val="0"/>
+      <w:autoSpaceDE w:val="0"/>
+      <w:autoSpaceDN w:val="0"/>
+      <w:adjustRightInd w:val="0"/>
+      <w:spacing w:before="240" w:after="0" w:line="259" w:lineRule="auto"/>
+      <w:ind w:left="360" w:hanging="360"/>
+      <w:textAlignment w:val="baseline"/>
+    </w:pPr>
+    <w:rPr>
+      <w:rFonts w:ascii="Arial" w:eastAsia="Times New Roman" w:hAnsi="Arial" w:cs="Times New Roman"/>
+      <w:kern w:val="0"/>
+      <w:sz w:val="22"/>
+      <w:szCs w:val="20"/>
+      <w:lang w:eastAsia="de-DE"/>
+      <w14:ligatures w14:val="none"/>
+    </w:rPr>
+  </w:style>
+  <w:style w:type="paragraph" w:customStyle="1" w:styleId="E49884F847874509BF53495EC1E49D49">
+    <w:name w:val="E49884F847874509BF53495EC1E49D49"/>
+    <w:rsid w:val="009852EF"/>
     <w:pPr>
       <w:overflowPunct w:val="0"/>
       <w:autoSpaceDE w:val="0"/>
@@ -19748,9 +19807,9 @@
       <w14:ligatures w14:val="none"/>
     </w:rPr>
   </w:style>
-  <w:style w:type="paragraph" w:customStyle="1" w:styleId="C6EB278CD1704CBDBE847912548187641">
-    <w:name w:val="C6EB278CD1704CBDBE847912548187641"/>
-    <w:rsid w:val="00DE739C"/>
+  <w:style w:type="paragraph" w:customStyle="1" w:styleId="C6EB278CD1704CBDBE84791254818764">
+    <w:name w:val="C6EB278CD1704CBDBE84791254818764"/>
+    <w:rsid w:val="009852EF"/>
     <w:pPr>
       <w:overflowPunct w:val="0"/>
       <w:autoSpaceDE w:val="0"/>
@@ -19768,9 +19827,9 @@
       <w14:ligatures w14:val="none"/>
     </w:rPr>
   </w:style>
-  <w:style w:type="paragraph" w:customStyle="1" w:styleId="2DE5343C3E5844A6B150CF244BEDE0531">
-    <w:name w:val="2DE5343C3E5844A6B150CF244BEDE0531"/>
-    <w:rsid w:val="00DE739C"/>
+  <w:style w:type="paragraph" w:customStyle="1" w:styleId="2DE5343C3E5844A6B150CF244BEDE053">
+    <w:name w:val="2DE5343C3E5844A6B150CF244BEDE053"/>
+    <w:rsid w:val="009852EF"/>
     <w:pPr>
       <w:overflowPunct w:val="0"/>
       <w:autoSpaceDE w:val="0"/>
@@ -19788,9 +19847,9 @@
       <w14:ligatures w14:val="none"/>
     </w:rPr>
   </w:style>
-  <w:style w:type="paragraph" w:customStyle="1" w:styleId="1B13E575BC6D4FF4AB5D4C1DFB3786B41">
-    <w:name w:val="1B13E575BC6D4FF4AB5D4C1DFB3786B41"/>
-    <w:rsid w:val="00DE739C"/>
+  <w:style w:type="paragraph" w:customStyle="1" w:styleId="1B13E575BC6D4FF4AB5D4C1DFB3786B4">
+    <w:name w:val="1B13E575BC6D4FF4AB5D4C1DFB3786B4"/>
+    <w:rsid w:val="009852EF"/>
     <w:pPr>
       <w:overflowPunct w:val="0"/>
       <w:autoSpaceDE w:val="0"/>
@@ -19808,9 +19867,9 @@
       <w14:ligatures w14:val="none"/>
     </w:rPr>
   </w:style>
-  <w:style w:type="paragraph" w:customStyle="1" w:styleId="60D278276478419586CC348C6D6D692C1">
-    <w:name w:val="60D278276478419586CC348C6D6D692C1"/>
-    <w:rsid w:val="00DE739C"/>
+  <w:style w:type="paragraph" w:customStyle="1" w:styleId="60D278276478419586CC348C6D6D692C">
+    <w:name w:val="60D278276478419586CC348C6D6D692C"/>
+    <w:rsid w:val="009852EF"/>
     <w:pPr>
       <w:overflowPunct w:val="0"/>
       <w:autoSpaceDE w:val="0"/>
@@ -19828,9 +19887,9 @@
       <w14:ligatures w14:val="none"/>
     </w:rPr>
   </w:style>
-  <w:style w:type="paragraph" w:customStyle="1" w:styleId="5191FCBEB67E487C8ECD99605A3151C91">
-    <w:name w:val="5191FCBEB67E487C8ECD99605A3151C91"/>
-    <w:rsid w:val="00DE739C"/>
+  <w:style w:type="paragraph" w:customStyle="1" w:styleId="5191FCBEB67E487C8ECD99605A3151C9">
+    <w:name w:val="5191FCBEB67E487C8ECD99605A3151C9"/>
+    <w:rsid w:val="009852EF"/>
     <w:pPr>
       <w:overflowPunct w:val="0"/>
       <w:autoSpaceDE w:val="0"/>
@@ -19848,9 +19907,9 @@
       <w14:ligatures w14:val="none"/>
     </w:rPr>
   </w:style>
-  <w:style w:type="paragraph" w:customStyle="1" w:styleId="BAF60F6589B84E0D92E8D2BF0CC2B96E1">
-    <w:name w:val="BAF60F6589B84E0D92E8D2BF0CC2B96E1"/>
-    <w:rsid w:val="00DE739C"/>
+  <w:style w:type="paragraph" w:customStyle="1" w:styleId="BAF60F6589B84E0D92E8D2BF0CC2B96E">
+    <w:name w:val="BAF60F6589B84E0D92E8D2BF0CC2B96E"/>
+    <w:rsid w:val="009852EF"/>
     <w:pPr>
       <w:overflowPunct w:val="0"/>
       <w:autoSpaceDE w:val="0"/>
@@ -19868,9 +19927,9 @@
       <w14:ligatures w14:val="none"/>
     </w:rPr>
   </w:style>
-  <w:style w:type="paragraph" w:customStyle="1" w:styleId="9D4DE7BCC667470F9F00F23B1FD614491">
-    <w:name w:val="9D4DE7BCC667470F9F00F23B1FD614491"/>
-    <w:rsid w:val="00DE739C"/>
+  <w:style w:type="paragraph" w:customStyle="1" w:styleId="9D4DE7BCC667470F9F00F23B1FD61449">
+    <w:name w:val="9D4DE7BCC667470F9F00F23B1FD61449"/>
+    <w:rsid w:val="009852EF"/>
     <w:pPr>
       <w:overflowPunct w:val="0"/>
       <w:autoSpaceDE w:val="0"/>
@@ -19888,37 +19947,9 @@
       <w14:ligatures w14:val="none"/>
     </w:rPr>
   </w:style>
-  <w:style w:type="paragraph" w:customStyle="1" w:styleId="207A677C38764BE9A399D536A56AD62D1">
-    <w:name w:val="207A677C38764BE9A399D536A56AD62D1"/>
-    <w:rsid w:val="00DE739C"/>
-    <w:pPr>
-      <w:numPr>
-        <w:numId w:val="1"/>
-      </w:numPr>
-      <w:tabs>
-        <w:tab w:val="clear" w:pos="720"/>
-      </w:tabs>
-      <w:overflowPunct w:val="0"/>
-      <w:autoSpaceDE w:val="0"/>
-      <w:autoSpaceDN w:val="0"/>
-      <w:adjustRightInd w:val="0"/>
-      <w:spacing w:after="0" w:line="259" w:lineRule="auto"/>
-      <w:ind w:left="357" w:hanging="357"/>
-      <w:contextualSpacing/>
-      <w:textAlignment w:val="baseline"/>
-    </w:pPr>
-    <w:rPr>
-      <w:rFonts w:ascii="Arial" w:eastAsia="Times New Roman" w:hAnsi="Arial" w:cs="Times New Roman"/>
-      <w:kern w:val="0"/>
-      <w:sz w:val="22"/>
-      <w:szCs w:val="20"/>
-      <w:lang w:eastAsia="de-DE"/>
-      <w14:ligatures w14:val="none"/>
-    </w:rPr>
-  </w:style>
-  <w:style w:type="paragraph" w:customStyle="1" w:styleId="5263167169884FD4BA307CDFDC664716">
-    <w:name w:val="5263167169884FD4BA307CDFDC664716"/>
-    <w:rsid w:val="00DE739C"/>
+  <w:style w:type="paragraph" w:customStyle="1" w:styleId="207A677C38764BE9A399D536A56AD62D">
+    <w:name w:val="207A677C38764BE9A399D536A56AD62D"/>
+    <w:rsid w:val="009852EF"/>
     <w:pPr>
       <w:overflowPunct w:val="0"/>
       <w:autoSpaceDE w:val="0"/>
@@ -19938,9 +19969,9 @@
       <w14:ligatures w14:val="none"/>
     </w:rPr>
   </w:style>
-  <w:style w:type="paragraph" w:customStyle="1" w:styleId="A180639606504698B96388E663B5AB3F">
-    <w:name w:val="A180639606504698B96388E663B5AB3F"/>
-    <w:rsid w:val="00DE739C"/>
+  <w:style w:type="paragraph" w:customStyle="1" w:styleId="5263167169884FD4BA307CDFDC6647161">
+    <w:name w:val="5263167169884FD4BA307CDFDC6647161"/>
+    <w:rsid w:val="009852EF"/>
     <w:pPr>
       <w:overflowPunct w:val="0"/>
       <w:autoSpaceDE w:val="0"/>
@@ -19960,29 +19991,9 @@
       <w14:ligatures w14:val="none"/>
     </w:rPr>
   </w:style>
-  <w:style w:type="paragraph" w:customStyle="1" w:styleId="39370F559F6E4DA9884457D62EE7A77C">
-    <w:name w:val="39370F559F6E4DA9884457D62EE7A77C"/>
-    <w:rsid w:val="00DE739C"/>
-    <w:pPr>
-      <w:overflowPunct w:val="0"/>
-      <w:autoSpaceDE w:val="0"/>
-      <w:autoSpaceDN w:val="0"/>
-      <w:adjustRightInd w:val="0"/>
-      <w:spacing w:after="0" w:line="259" w:lineRule="auto"/>
-      <w:textAlignment w:val="baseline"/>
-    </w:pPr>
-    <w:rPr>
-      <w:rFonts w:ascii="Arial" w:eastAsia="Times New Roman" w:hAnsi="Arial" w:cs="Times New Roman"/>
-      <w:kern w:val="0"/>
-      <w:sz w:val="22"/>
-      <w:szCs w:val="20"/>
-      <w:lang w:eastAsia="de-DE"/>
-      <w14:ligatures w14:val="none"/>
-    </w:rPr>
-  </w:style>
-  <w:style w:type="paragraph" w:customStyle="1" w:styleId="C84818893C63427FAC1F69959CA0D53C">
-    <w:name w:val="C84818893C63427FAC1F69959CA0D53C"/>
-    <w:rsid w:val="00DE739C"/>
+  <w:style w:type="paragraph" w:customStyle="1" w:styleId="A180639606504698B96388E663B5AB3F1">
+    <w:name w:val="A180639606504698B96388E663B5AB3F1"/>
+    <w:rsid w:val="009852EF"/>
     <w:pPr>
       <w:overflowPunct w:val="0"/>
       <w:autoSpaceDE w:val="0"/>
@@ -20002,9 +20013,9 @@
       <w14:ligatures w14:val="none"/>
     </w:rPr>
   </w:style>
-  <w:style w:type="paragraph" w:customStyle="1" w:styleId="C13D514652DD4F39A895AFE92DCD5C681">
-    <w:name w:val="C13D514652DD4F39A895AFE92DCD5C681"/>
-    <w:rsid w:val="00DE739C"/>
+  <w:style w:type="paragraph" w:customStyle="1" w:styleId="39370F559F6E4DA9884457D62EE7A77C1">
+    <w:name w:val="39370F559F6E4DA9884457D62EE7A77C1"/>
+    <w:rsid w:val="009852EF"/>
     <w:pPr>
       <w:overflowPunct w:val="0"/>
       <w:autoSpaceDE w:val="0"/>
@@ -20022,9 +20033,51 @@
       <w14:ligatures w14:val="none"/>
     </w:rPr>
   </w:style>
-  <w:style w:type="paragraph" w:customStyle="1" w:styleId="886E5B9C5500423392DB9BE8694BF3F6">
-    <w:name w:val="886E5B9C5500423392DB9BE8694BF3F6"/>
-    <w:rsid w:val="00DE739C"/>
+  <w:style w:type="paragraph" w:customStyle="1" w:styleId="C84818893C63427FAC1F69959CA0D53C1">
+    <w:name w:val="C84818893C63427FAC1F69959CA0D53C1"/>
+    <w:rsid w:val="009852EF"/>
+    <w:pPr>
+      <w:overflowPunct w:val="0"/>
+      <w:autoSpaceDE w:val="0"/>
+      <w:autoSpaceDN w:val="0"/>
+      <w:adjustRightInd w:val="0"/>
+      <w:spacing w:after="0" w:line="259" w:lineRule="auto"/>
+      <w:ind w:left="357" w:hanging="357"/>
+      <w:contextualSpacing/>
+      <w:textAlignment w:val="baseline"/>
+    </w:pPr>
+    <w:rPr>
+      <w:rFonts w:ascii="Arial" w:eastAsia="Times New Roman" w:hAnsi="Arial" w:cs="Times New Roman"/>
+      <w:kern w:val="0"/>
+      <w:sz w:val="22"/>
+      <w:szCs w:val="20"/>
+      <w:lang w:eastAsia="de-DE"/>
+      <w14:ligatures w14:val="none"/>
+    </w:rPr>
+  </w:style>
+  <w:style w:type="paragraph" w:customStyle="1" w:styleId="C13D514652DD4F39A895AFE92DCD5C68">
+    <w:name w:val="C13D514652DD4F39A895AFE92DCD5C68"/>
+    <w:rsid w:val="009852EF"/>
+    <w:pPr>
+      <w:overflowPunct w:val="0"/>
+      <w:autoSpaceDE w:val="0"/>
+      <w:autoSpaceDN w:val="0"/>
+      <w:adjustRightInd w:val="0"/>
+      <w:spacing w:after="0" w:line="259" w:lineRule="auto"/>
+      <w:textAlignment w:val="baseline"/>
+    </w:pPr>
+    <w:rPr>
+      <w:rFonts w:ascii="Arial" w:eastAsia="Times New Roman" w:hAnsi="Arial" w:cs="Times New Roman"/>
+      <w:kern w:val="0"/>
+      <w:sz w:val="22"/>
+      <w:szCs w:val="20"/>
+      <w:lang w:eastAsia="de-DE"/>
+      <w14:ligatures w14:val="none"/>
+    </w:rPr>
+  </w:style>
+  <w:style w:type="paragraph" w:customStyle="1" w:styleId="886E5B9C5500423392DB9BE8694BF3F61">
+    <w:name w:val="886E5B9C5500423392DB9BE8694BF3F61"/>
+    <w:rsid w:val="009852EF"/>
     <w:pPr>
       <w:overflowPunct w:val="0"/>
       <w:autoSpaceDE w:val="0"/>
@@ -20046,7 +20099,7 @@
 </file>
 
 <file path=word/glossary/webSettings.xml><?xml version="1.0" encoding="utf-8"?>
-<w:webSettings xmlns:mc="http://schemas.openxmlformats.org/markup-compatibility/2006" xmlns:r="http://schemas.openxmlformats.org/officeDocument/2006/relationships" xmlns:w="http://schemas.openxmlformats.org/wordprocessingml/2006/main" xmlns:w14="http://schemas.microsoft.com/office/word/2010/wordml" xmlns:w15="http://schemas.microsoft.com/office/word/2012/wordml" xmlns:w16cex="http://schemas.microsoft.com/office/word/2018/wordml/cex" xmlns:w16cid="http://schemas.microsoft.com/office/word/2016/wordml/cid" xmlns:w16="http://schemas.microsoft.com/office/word/2018/wordml" xmlns:w16du="http://schemas.microsoft.com/office/word/2023/wordml/word16du" xmlns:w16sdtdh="http://schemas.microsoft.com/office/word/2020/wordml/sdtdatahash" xmlns:w16se="http://schemas.microsoft.com/office/word/2015/wordml/symex" mc:Ignorable="w14 w15 w16se w16cid w16 w16cex w16sdtdh w16du">
+<w:webSettings xmlns:mc="http://schemas.openxmlformats.org/markup-compatibility/2006" xmlns:r="http://schemas.openxmlformats.org/officeDocument/2006/relationships" xmlns:w="http://schemas.openxmlformats.org/wordprocessingml/2006/main" xmlns:w14="http://schemas.microsoft.com/office/word/2010/wordml" xmlns:w15="http://schemas.microsoft.com/office/word/2012/wordml" xmlns:w16cex="http://schemas.microsoft.com/office/word/2018/wordml/cex" xmlns:w16cid="http://schemas.microsoft.com/office/word/2016/wordml/cid" xmlns:w16="http://schemas.microsoft.com/office/word/2018/wordml" xmlns:w16du="http://schemas.microsoft.com/office/word/2023/wordml/word16du" xmlns:w16sdtdh="http://schemas.microsoft.com/office/word/2020/wordml/sdtdatahash" xmlns:w16sdtfl="http://schemas.microsoft.com/office/word/2024/wordml/sdtformatlock" xmlns:w16se="http://schemas.microsoft.com/office/word/2015/wordml/symex" mc:Ignorable="w14 w15 w16se w16cid w16 w16cex w16sdtdh w16sdtfl w16du">
   <w:optimizeForBrowser/>
 </w:webSettings>
 </file>

</xml_diff>